<commit_message>
Updates to the body of the document
</commit_message>
<xml_diff>
--- a/absalom_four_dimensions.docx
+++ b/absalom_four_dimensions.docx
@@ -43,7 +43,37 @@
         <w:t xml:space="preserve"> </w:t>
       </w:r>
       <w:r>
-        <w:t xml:space="preserve">Dimensions</w:t>
+        <w:t xml:space="preserve">Dimensions:</w:t>
+      </w:r>
+      <w:r>
+        <w:t xml:space="preserve"> </w:t>
+      </w:r>
+      <w:r>
+        <w:t xml:space="preserve">Characters,</w:t>
+      </w:r>
+      <w:r>
+        <w:t xml:space="preserve"> </w:t>
+      </w:r>
+      <w:r>
+        <w:t xml:space="preserve">Locations,</w:t>
+      </w:r>
+      <w:r>
+        <w:t xml:space="preserve"> </w:t>
+      </w:r>
+      <w:r>
+        <w:t xml:space="preserve">Events,</w:t>
+      </w:r>
+      <w:r>
+        <w:t xml:space="preserve"> </w:t>
+      </w:r>
+      <w:r>
+        <w:t xml:space="preserve">and</w:t>
+      </w:r>
+      <w:r>
+        <w:t xml:space="preserve"> </w:t>
+      </w:r>
+      <w:r>
+        <w:t xml:space="preserve">Language</w:t>
       </w:r>
     </w:p>
     <w:p>
@@ -1542,17 +1572,7 @@
         <w:t xml:space="preserve"> </w:t>
       </w:r>
       <w:r>
-        <w:t xml:space="preserve">(</w:t>
-      </w:r>
-      <w:r>
-        <w:rPr>
-          <w:bCs/>
-          <w:b/>
-        </w:rPr>
-        <w:t xml:space="preserve">RN20?</w:t>
-      </w:r>
-      <w:r>
-        <w:t xml:space="preserve">)</w:t>
+        <w:t xml:space="preserve">(Railey 118–19)</w:t>
       </w:r>
       <w:r>
         <w:t xml:space="preserve">. They all faced the same vicissitudes of frontier capitalism, and as Quentin bitingly remarks, made the type of deals that</w:t>
@@ -1919,14 +1939,14 @@
     </w:p>
     <w:p>
       <w:pPr>
-        <w:pStyle w:val="BodyText"/>
+        <w:pStyle w:val="CaptionedFigure"/>
       </w:pPr>
       <w:r>
         <w:drawing>
           <wp:inline>
             <wp:extent cx="5943600" cy="4682132"/>
             <wp:effectExtent b="0" l="0" r="0" t="0"/>
-            <wp:docPr descr="" title="" id="1" name="Picture"/>
+            <wp:docPr descr="Figure 2: All locations in Absalom, Absalom!. The map underscores the global scale of the novel." title="" id="1" name="Picture"/>
             <a:graphic>
               <a:graphicData uri="http://schemas.openxmlformats.org/drawingml/2006/picture">
                 <pic:pic>
@@ -1966,6 +1986,23 @@
     </w:p>
     <w:p>
       <w:pPr>
+        <w:pStyle w:val="ImageCaption"/>
+      </w:pPr>
+      <w:r>
+        <w:t xml:space="preserve">Figure 2: All locations in</w:t>
+      </w:r>
+      <w:r>
+        <w:t xml:space="preserve"> </w:t>
+      </w:r>
+      <w:r>
+        <w:t xml:space="preserve">Absalom, Absalom!</w:t>
+      </w:r>
+      <w:r>
+        <w:t xml:space="preserve">. The map underscores the global scale of the novel.</w:t>
+      </w:r>
+    </w:p>
+    <w:p>
+      <w:pPr>
         <w:pStyle w:val="BodyText"/>
       </w:pPr>
       <w:r>
@@ -2147,7 +2184,16 @@
         <w:pStyle w:val="BodyText"/>
       </w:pPr>
       <w:r>
-        <w:t xml:space="preserve">The displacement of slavery onto Haiti is both galling and puzzling. Haiti became the first Black republic in the Western Hemisphere in 1804, and thus abolished slavery several years before Sutpen was even born. This historical discrepancy has spawned a lengthy critical debate (See). Most recently, Wanda Raiford has made the provocative argument that the elision of the historical Haiti and its unqualified acceptance by every listener in the text, also implicates the reader in the erasure of US imperial history and Black agency</w:t>
+        <w:t xml:space="preserve">The displacement of slavery onto Haiti is striking. Haiti became the first Black republic in the Western Hemisphere in 1804, and thus abolished slavery several years before Sutpen was even born. This historical discrepancy has spawned a substantial critical debate (See for example:</w:t>
+      </w:r>
+      <w:r>
+        <w:t xml:space="preserve"> </w:t>
+      </w:r>
+      <w:r>
+        <w:t xml:space="preserve">(Godden; Matthews; Stanchich)</w:t>
+      </w:r>
+      <w:r>
+        <w:t xml:space="preserve">). Most recently, Wanda Raiford has made the provocative argument that the elision of the historical Haiti and its unqualified acceptance by every listener in the text, also implicates the reader in the erasure of US imperial history and Black agency</w:t>
       </w:r>
       <w:r>
         <w:t xml:space="preserve"> </w:t>
@@ -2227,10 +2273,7 @@
         <w:t xml:space="preserve">(Beckert et al. 226?)</w:t>
       </w:r>
       <w:r>
-        <w:t xml:space="preserve"> </w:t>
-      </w:r>
-      <w:r>
-        <w:t xml:space="preserve">(Beckert ET AL, 226?). Historically, Quentin is following in the footsteps of other sons of slave owners and, later, former slave owners who went to Harvard and other elite institutions to be conferred a degree and respectability</w:t>
+        <w:t xml:space="preserve">. Historically, Quentin is following in the footsteps of other sons of slave owners and, later, former slave owners who went to Harvard and other elite Northern institutions to be conferred a degree and respectability</w:t>
       </w:r>
       <w:r>
         <w:t xml:space="preserve"> </w:t>
@@ -2972,7 +3015,7 @@
     </w:p>
     <w:bookmarkEnd w:id="37"/>
     <w:bookmarkEnd w:id="38"/>
-    <w:bookmarkStart w:id="46" w:name="part-4-language"/>
+    <w:bookmarkStart w:id="44" w:name="part-4-language"/>
     <w:p>
       <w:pPr>
         <w:pStyle w:val="Heading2"/>
@@ -2981,7 +3024,7 @@
         <w:t xml:space="preserve">Part 4: Language</w:t>
       </w:r>
     </w:p>
-    <w:bookmarkStart w:id="42" w:name="Xe5ab652b07578813747b1e7722c4326a57386f3"/>
+    <w:bookmarkStart w:id="43" w:name="Xe5ab652b07578813747b1e7722c4326a57386f3"/>
     <w:p>
       <w:pPr>
         <w:pStyle w:val="Heading3"/>
@@ -3223,7 +3266,37 @@
         <w:t xml:space="preserve"> </w:t>
       </w:r>
       <w:r>
-        <w:t xml:space="preserve">(Faulkner 84)</w:t>
+        <w:t xml:space="preserve">(Faulkner,</w:t>
+      </w:r>
+      <w:r>
+        <w:t xml:space="preserve"> </w:t>
+      </w:r>
+      <w:r>
+        <w:rPr>
+          <w:iCs/>
+          <w:i/>
+        </w:rPr>
+        <w:t xml:space="preserve">Faulkner in the</w:t>
+      </w:r>
+      <w:r>
+        <w:rPr>
+          <w:iCs/>
+          <w:i/>
+        </w:rPr>
+        <w:t xml:space="preserve"> </w:t>
+      </w:r>
+      <w:r>
+        <w:rPr>
+          <w:iCs/>
+          <w:i/>
+        </w:rPr>
+        <w:t xml:space="preserve">University</w:t>
+      </w:r>
+      <w:r>
+        <w:t xml:space="preserve"> </w:t>
+      </w:r>
+      <w:r>
+        <w:t xml:space="preserve">84)</w:t>
       </w:r>
       <w:r>
         <w:t xml:space="preserve">. In a sense, the prose complements the narrative structure, which also sees the past continuously returning.</w:t>
@@ -3250,7 +3323,19 @@
         <w:t xml:space="preserve"> </w:t>
       </w:r>
       <w:r>
-        <w:t xml:space="preserve">distinguishes itself. Faulkner uses what can only be considered a life time’s supply of parentheses - 1278 total. These parenthetical statements are used to elucidate, complicate, contradict, and trouble, the</w:t>
+        <w:t xml:space="preserve">distinguishes itself. Faulkner uses what can only be considered a life time’s supply of parentheses - 1278 total or 639 pairs.</w:t>
+      </w:r>
+      <w:r>
+        <w:rPr>
+          <w:rStyle w:val="FootnoteReference"/>
+        </w:rPr>
+        <w:footnoteReference w:id="39"/>
+      </w:r>
+      <w:r>
+        <w:t xml:space="preserve"> </w:t>
+      </w:r>
+      <w:r>
+        <w:t xml:space="preserve">These parenthetical statements are used to elucidate, complicate, contradict, and trouble, the</w:t>
       </w:r>
       <w:r>
         <w:t xml:space="preserve"> </w:t>
@@ -3298,7 +3383,7 @@
           <wp:inline>
             <wp:extent cx="5943600" cy="1934765"/>
             <wp:effectExtent b="0" l="0" r="0" t="0"/>
-            <wp:docPr descr="Figure 4: Snapshort of all parentheses in Absalom, Absalom! ordered by their level of nesting." title="" id="1" name="Picture"/>
+            <wp:docPr descr="Figure 4: Snapshot of all parentheses in Absalom, Absalom! ordered by their level of nesting." title="" id="1" name="Picture"/>
             <a:graphic>
               <a:graphicData uri="http://schemas.openxmlformats.org/drawingml/2006/picture">
                 <pic:pic>
@@ -3309,7 +3394,7 @@
                     </pic:cNvPicPr>
                   </pic:nvPicPr>
                   <pic:blipFill>
-                    <a:blip r:embed="rId39"/>
+                    <a:blip r:embed="rId40"/>
                     <a:stretch>
                       <a:fillRect/>
                     </a:stretch>
@@ -3341,7 +3426,7 @@
         <w:pStyle w:val="ImageCaption"/>
       </w:pPr>
       <w:r>
-        <w:t xml:space="preserve">Figure 4: Snapshort of all parentheses in</w:t>
+        <w:t xml:space="preserve">Figure 4: Snapshot of all parentheses in</w:t>
       </w:r>
       <w:r>
         <w:t xml:space="preserve"> </w:t>
@@ -3395,7 +3480,7 @@
         <w:t xml:space="preserve"> </w:t>
       </w:r>
       <w:r>
-        <w:t xml:space="preserve">is about him as it is about the Sutpen’s. He is always there haunting the text in his own way.</w:t>
+        <w:t xml:space="preserve">is about his confrontation with the past, as it is about the sordid history of the Sutpens.</w:t>
       </w:r>
     </w:p>
     <w:p>
@@ -3458,7 +3543,7 @@
         <w:rPr>
           <w:rStyle w:val="FootnoteReference"/>
         </w:rPr>
-        <w:footnoteReference w:id="40"/>
+        <w:footnoteReference w:id="41"/>
       </w:r>
     </w:p>
     <w:p>
@@ -3466,7 +3551,16 @@
         <w:pStyle w:val="BodyText"/>
       </w:pPr>
       <w:r>
-        <w:t xml:space="preserve">Another element that can be disorienting is that it is also a repetitious book. Words and phrases echo throughout the text and evoke the sense that one is rereading a particular passage several times. This effect can be observed in the data about the text as well. Computationally, it is possible to calculate how many phrases repeat over the course of the narrative. Such phrases are called n-grams where</w:t>
+        <w:t xml:space="preserve">Another element that can be disorienting is that it is also a repetitious book. Words, phrases, scenes, and narrators echo one another throughout the text and evoke the sense that one is rereading a particular passage several times</w:t>
+      </w:r>
+      <w:r>
+        <w:t xml:space="preserve"> </w:t>
+      </w:r>
+      <w:r>
+        <w:t xml:space="preserve">(Rio-Jelliffe 76)</w:t>
+      </w:r>
+      <w:r>
+        <w:t xml:space="preserve">. This effect can be observed in the data about the text as well. Computationally, it is possible to calculate how many phrases repeat over the course of the narrative. Such phrases are called n-grams where</w:t>
       </w:r>
       <w:r>
         <w:t xml:space="preserve"> </w:t>
@@ -3482,7 +3576,7 @@
         <w:t xml:space="preserve"> </w:t>
       </w:r>
       <w:r>
-        <w:t xml:space="preserve">indicates the number of words in the phrase. Thus, an n-gram can be two words: Charles Bon, or it can be much longer. The longest ngram is the sixteen word sentence,</w:t>
+        <w:t xml:space="preserve">indicates the number of words in the phrase. Thus, an n-gram can be two words: Charles Bon, or it can be much longer. The longest n-gram is the sixteen word sentence,</w:t>
       </w:r>
       <w:r>
         <w:t xml:space="preserve"> </w:t>
@@ -3577,7 +3671,7 @@
         <w:rPr>
           <w:rStyle w:val="FootnoteReference"/>
         </w:rPr>
-        <w:footnoteReference w:id="41"/>
+        <w:footnoteReference w:id="42"/>
       </w:r>
     </w:p>
     <w:p>
@@ -3720,305 +3814,103 @@
         <w:t xml:space="preserve">Moreover, the constant repetitions also draw attention to the narrativity of narration. Since signature phrases, scenes, and whole lines of inquiry repeat throughout the text, the meaning of each instance changes with each iteration. The same language is constantly cast in a new light, demonstrating that what is being said cannot be separated from how it is being said. It is the linguistic corollary to the repetitions in the plot structure that continuously ask the reader to reevaluate the grounding assumptions of their knowledge.</w:t>
       </w:r>
     </w:p>
-    <w:bookmarkEnd w:id="42"/>
-    <w:bookmarkStart w:id="43" w:name="conclusion"/>
-    <w:p>
-      <w:pPr>
-        <w:pStyle w:val="Heading3"/>
+    <w:bookmarkEnd w:id="43"/>
+    <w:bookmarkEnd w:id="44"/>
+    <w:bookmarkStart w:id="45" w:name="conclusion"/>
+    <w:p>
+      <w:pPr>
+        <w:pStyle w:val="Heading2"/>
       </w:pPr>
       <w:r>
         <w:t xml:space="preserve">Conclusion</w:t>
       </w:r>
     </w:p>
-    <w:bookmarkEnd w:id="43"/>
-    <w:bookmarkStart w:id="44" w:name="apendix-a-superfluous"/>
-    <w:p>
-      <w:pPr>
-        <w:pStyle w:val="Heading3"/>
-      </w:pPr>
-      <w:r>
-        <w:t xml:space="preserve">Apendix A: Superfluous</w:t>
-      </w:r>
-    </w:p>
-    <w:p>
-      <w:pPr>
-        <w:pStyle w:val="FirstParagraph"/>
-      </w:pPr>
-      <w:r>
-        <w:t xml:space="preserve">Next to race and class, there is a third way to read the novel through its characters: death. The multiple figurative and literal dead-ends can also be seen as the effect of the plantation system destroying the very social relations it is aiming to maintain. Of the 15 characters who die in the novel, only 2 (13%) die of old age - Ikkemotubbe and Rosa - the rest dies by murder (40%), suicide (40%), or disease (33%). The two characters who die peacefully, Ikkemottube and Rosa, are rather poetic book-ends to Sutpen’s tale of the destruction. The former is cheated out of his land and displaced, and the latter is cheated out of a marriage and lives as a recluse. The fates of the protagonists are much more grim. Charles Bon is killed by his half-brother, Judith and Charles Etienne who both have transgressive desires across the color line and die of</w:t>
-      </w:r>
-      <w:r>
-        <w:t xml:space="preserve"> </w:t>
-      </w:r>
-      <w:r>
-        <w:t xml:space="preserve">“</w:t>
-      </w:r>
-      <w:r>
-        <w:t xml:space="preserve">yellow fever</w:t>
-      </w:r>
-      <w:r>
-        <w:t xml:space="preserve">”</w:t>
-      </w:r>
-      <w:r>
-        <w:t xml:space="preserve"> </w:t>
-      </w:r>
-      <w:r>
-        <w:t xml:space="preserve">- a disease that was associated with racial otherness (CLOUGH 96), Clytemnestra starts the fire that kills both she and Henry - eternal physical and spiritual prisoners of Sutpen’s Hundred. The only remainder of the Sutpen line is Jim Bond whose incoherent</w:t>
-      </w:r>
-      <w:r>
-        <w:t xml:space="preserve"> </w:t>
-      </w:r>
-      <w:r>
-        <w:t xml:space="preserve">“</w:t>
-      </w:r>
-      <w:r>
-        <w:t xml:space="preserve">howling</w:t>
-      </w:r>
-      <w:r>
-        <w:t xml:space="preserve">”</w:t>
-      </w:r>
-      <w:r>
-        <w:t xml:space="preserve"> </w:t>
-      </w:r>
-      <w:r>
-        <w:t xml:space="preserve">(300) is a haunting rejoinder to the perverted social system that died before he was born but nonetheless created him. In the end, the plantocratic elite is consumed by the very violence and expropriation that sustained it right up until Civil War. To paraphrase Quentin’s father, the entire Sutpen line, and the South more generally,</w:t>
-      </w:r>
-      <w:r>
-        <w:t xml:space="preserve"> </w:t>
-      </w:r>
-      <w:r>
-        <w:t xml:space="preserve">“</w:t>
-      </w:r>
-      <w:r>
-        <w:t xml:space="preserve">pays the price for having erected its economic edifice not on the rock of stern morality but on the shifting sands of opportunism and moral brigandage</w:t>
-      </w:r>
-      <w:r>
-        <w:t xml:space="preserve">”</w:t>
-      </w:r>
-      <w:r>
-        <w:t xml:space="preserve"> </w:t>
-      </w:r>
-      <w:r>
-        <w:t xml:space="preserve">(209).</w:t>
-      </w:r>
-    </w:p>
-    <w:bookmarkEnd w:id="44"/>
-    <w:bookmarkStart w:id="45" w:name="appendix-2-plot-overflow"/>
-    <w:p>
-      <w:pPr>
-        <w:pStyle w:val="Heading3"/>
-      </w:pPr>
-      <w:r>
-        <w:t xml:space="preserve">Appendix 2: Plot overflow</w:t>
-      </w:r>
-    </w:p>
-    <w:p>
-      <w:pPr>
-        <w:pStyle w:val="FirstParagraph"/>
-      </w:pPr>
-      <w:r>
-        <w:t xml:space="preserve">Another way to think about the relationship between the lives of the narrators and the communal story of Sutpen, is as a commentary on the nature of historical inquiry. While it may seem that by the end of the narrative, the entire sordid history is dredged up, nothing could be farther from the truth. The narrative introduces so many overlapping and contradictory sources of information that it is hard to distinguish truth from falsehood. There are no fewer than 15 unique sources of information such as major narrators like Rosa and Mr. Compson, but also artifacts like Bon’s letter and town gossip that appears to come from nowhere but shapes the perceptions of each character.</w:t>
-      </w:r>
-    </w:p>
-    <w:p>
-      <w:pPr>
-        <w:pStyle w:val="BodyText"/>
-      </w:pPr>
-      <w:r>
-        <w:t xml:space="preserve">Unlike Faulkner’s other texts though, these sources of information are not necessarily distinct from one another. Famously, Shreve and Quentin’s voices start to merge towards the end of the novel. The critical attention on this section tends to overshadow the fact that much of the novel is being being reconstituted by its narrators through several different sources simultaneously. For instance, when recounting his life story in 1834, Sutpen tells Quentin’s grandfather plainly,</w:t>
-      </w:r>
-      <w:r>
-        <w:t xml:space="preserve"> </w:t>
-      </w:r>
-      <w:r>
-        <w:t xml:space="preserve">“</w:t>
-      </w:r>
-      <w:r>
-        <w:t xml:space="preserve">So I went to the West Indies</w:t>
-      </w:r>
-      <w:r>
-        <w:t xml:space="preserve">”</w:t>
-      </w:r>
-      <w:r>
-        <w:t xml:space="preserve"> </w:t>
-      </w:r>
-      <w:r>
-        <w:t xml:space="preserve">(193), which Quentin repeats to Shreve in 1910. Sutpen, Quentin’s grandfather, and Quentin are all sources of the information, even if it seems implausible that this would be a verbatim transmission. Believing this means trusting that Quentin recalls exactly what his grandfather said at an unspecified previous date, and that his grandfather, in turn, remembered a conversation he had at least seventy years previous, late at night, while drinking heavily. This is doubtful.</w:t>
-      </w:r>
-    </w:p>
-    <w:p>
-      <w:pPr>
-        <w:pStyle w:val="BodyText"/>
-      </w:pPr>
-      <w:r>
-        <w:t xml:space="preserve">However problematic establishing the sourcing for each event might be, the</w:t>
-      </w:r>
-      <w:r>
-        <w:t xml:space="preserve"> </w:t>
-      </w:r>
-      <w:r>
-        <w:rPr>
-          <w:iCs/>
-          <w:i/>
-        </w:rPr>
-        <w:t xml:space="preserve">Absalom, Absalom!</w:t>
-      </w:r>
-      <w:r>
-        <w:t xml:space="preserve"> </w:t>
-      </w:r>
-      <w:r>
-        <w:t xml:space="preserve">coding team director, Steve Railton, has marked all of them. In a sizeable number of cases, the narrative is compiled through multiple-sources (33%). There is no real way disaggregate these sources from one another. Moreover, this would work against the grain of the text, which is continuously reinforcing the communal nature of historical recollection. This caveat granted, it is possible to bluntly calculate how much each of the 15 sources contributes to the narrative. Certainly, this is not an exact measure, but the relative differences are quite revealing.</w:t>
-      </w:r>
-    </w:p>
-    <w:p>
-      <w:pPr>
-        <w:pStyle w:val="BodyText"/>
-      </w:pPr>
-      <w:r>
-        <w:t xml:space="preserve">The most prominent source of information is Quentin’s father (25%). Meanwhile, Quentin contributes significantly less to the story: 10%. Whether this number is low or high is a matter of perspective. On the one hand, as he was first invited by Miss Rosa to listen to her narrative so he could</w:t>
-      </w:r>
-      <w:r>
-        <w:t xml:space="preserve"> </w:t>
-      </w:r>
-      <w:r>
-        <w:t xml:space="preserve">“</w:t>
-      </w:r>
-      <w:r>
-        <w:t xml:space="preserve">write about it</w:t>
-      </w:r>
-      <w:r>
-        <w:t xml:space="preserve">”</w:t>
-      </w:r>
-      <w:r>
-        <w:t xml:space="preserve"> </w:t>
-      </w:r>
-      <w:r>
-        <w:t xml:space="preserve">and</w:t>
-      </w:r>
-      <w:r>
-        <w:t xml:space="preserve"> </w:t>
-      </w:r>
-      <w:r>
-        <w:t xml:space="preserve">“</w:t>
-      </w:r>
-      <w:r>
-        <w:t xml:space="preserve">submit it to the magazines</w:t>
-      </w:r>
-      <w:r>
-        <w:t xml:space="preserve">”</w:t>
-      </w:r>
-      <w:r>
-        <w:t xml:space="preserve"> </w:t>
-      </w:r>
-      <w:r>
-        <w:t xml:space="preserve">(5), it makes sense that he would contribute little to a narrative that he presumably does not fully know, even if he already knows part of it by simply</w:t>
-      </w:r>
-      <w:r>
-        <w:t xml:space="preserve"> </w:t>
-      </w:r>
-      <w:r>
-        <w:t xml:space="preserve">“</w:t>
-      </w:r>
-      <w:r>
-        <w:t xml:space="preserve">breathing the same air</w:t>
-      </w:r>
-      <w:r>
-        <w:t xml:space="preserve">”</w:t>
-      </w:r>
-      <w:r>
-        <w:t xml:space="preserve"> </w:t>
-      </w:r>
-      <w:r>
-        <w:t xml:space="preserve">(7). On the other hand, the dual voice of Shreve and Quentin actually contributes roughly the same amount 10%. This basic fact raises far more questions than it answers. If the ostensible point of the book is to uncover the history of the Sutpen family, why does the main historian, Quentin, ultimately cede the story to Shreve who fills in the gaps through flights of fancy? What does it say about historical inquiry if there is no way to establish a reliable source? The main historian, Mr. Compson, lays out a detailed account, but he does not know the most crucial detail: Sutpen’s first wife may have been part Black. More broadly, what does it mean when history and storytelling become indistinguishable from one another? It seems to imply that history may have little to do with the events themselves and their facticity, but only with how those events are selected, shaped, and told. That is, history does not exist outside of its telling.</w:t>
-      </w:r>
-    </w:p>
     <w:bookmarkEnd w:id="45"/>
+    <w:bookmarkStart w:id="81" w:name="references"/>
+    <w:p>
+      <w:pPr>
+        <w:pStyle w:val="Heading2"/>
+      </w:pPr>
+      <w:r>
+        <w:t xml:space="preserve">References</w:t>
+      </w:r>
+    </w:p>
+    <w:bookmarkStart w:id="80" w:name="refs"/>
+    <w:bookmarkStart w:id="46" w:name="ref-RN40"/>
+    <w:p>
+      <w:pPr>
+        <w:pStyle w:val="Bibliography"/>
+      </w:pPr>
+      <w:r>
+        <w:t xml:space="preserve">Beckert, Sven, et al.</w:t>
+      </w:r>
+      <w:r>
+        <w:t xml:space="preserve"> </w:t>
+      </w:r>
+      <w:r>
+        <w:t xml:space="preserve">“Harvard and Slavery:</w:t>
+      </w:r>
+      <w:r>
+        <w:t xml:space="preserve"> </w:t>
+      </w:r>
+      <w:r>
+        <w:t xml:space="preserve">A</w:t>
+      </w:r>
+      <w:r>
+        <w:t xml:space="preserve"> </w:t>
+      </w:r>
+      <w:r>
+        <w:t xml:space="preserve">Short History.”</w:t>
+      </w:r>
+      <w:r>
+        <w:t xml:space="preserve"> </w:t>
+      </w:r>
+      <w:r>
+        <w:rPr>
+          <w:iCs/>
+          <w:i/>
+        </w:rPr>
+        <w:t xml:space="preserve">Slavery and the University:</w:t>
+      </w:r>
+      <w:r>
+        <w:rPr>
+          <w:iCs/>
+          <w:i/>
+        </w:rPr>
+        <w:t xml:space="preserve"> </w:t>
+      </w:r>
+      <w:r>
+        <w:rPr>
+          <w:iCs/>
+          <w:i/>
+        </w:rPr>
+        <w:t xml:space="preserve">Histories</w:t>
+      </w:r>
+      <w:r>
+        <w:rPr>
+          <w:iCs/>
+          <w:i/>
+        </w:rPr>
+        <w:t xml:space="preserve"> </w:t>
+      </w:r>
+      <w:r>
+        <w:rPr>
+          <w:iCs/>
+          <w:i/>
+        </w:rPr>
+        <w:t xml:space="preserve">and Legacies</w:t>
+      </w:r>
+      <w:r>
+        <w:t xml:space="preserve">, edited by Leslie M. Harris et al., Universtiy of Georgia Press, 2019, pp. 224–50.</w:t>
+      </w:r>
+    </w:p>
     <w:bookmarkEnd w:id="46"/>
-    <w:bookmarkStart w:id="74" w:name="references"/>
-    <w:p>
-      <w:pPr>
-        <w:pStyle w:val="Heading1"/>
-      </w:pPr>
-      <w:r>
-        <w:t xml:space="preserve">References</w:t>
-      </w:r>
-    </w:p>
-    <w:bookmarkStart w:id="73" w:name="refs"/>
-    <w:bookmarkStart w:id="47" w:name="ref-RN40"/>
+    <w:bookmarkStart w:id="48" w:name="X15bf6e91eeb3477b474d09d1932d48074d2ef6b"/>
     <w:p>
       <w:pPr>
         <w:pStyle w:val="Bibliography"/>
       </w:pPr>
       <w:r>
-        <w:t xml:space="preserve">Beckert, Sven, et al.</w:t>
-      </w:r>
-      <w:r>
-        <w:t xml:space="preserve"> </w:t>
-      </w:r>
-      <w:r>
-        <w:t xml:space="preserve">“Harvard and Slavery:</w:t>
-      </w:r>
-      <w:r>
-        <w:t xml:space="preserve"> </w:t>
-      </w:r>
-      <w:r>
-        <w:t xml:space="preserve">A</w:t>
-      </w:r>
-      <w:r>
-        <w:t xml:space="preserve"> </w:t>
-      </w:r>
-      <w:r>
-        <w:t xml:space="preserve">Short History.”</w:t>
-      </w:r>
-      <w:r>
-        <w:t xml:space="preserve"> </w:t>
-      </w:r>
-      <w:r>
-        <w:rPr>
-          <w:iCs/>
-          <w:i/>
-        </w:rPr>
-        <w:t xml:space="preserve">Slavery and the University:</w:t>
-      </w:r>
-      <w:r>
-        <w:rPr>
-          <w:iCs/>
-          <w:i/>
-        </w:rPr>
-        <w:t xml:space="preserve"> </w:t>
-      </w:r>
-      <w:r>
-        <w:rPr>
-          <w:iCs/>
-          <w:i/>
-        </w:rPr>
-        <w:t xml:space="preserve">Histories</w:t>
-      </w:r>
-      <w:r>
-        <w:rPr>
-          <w:iCs/>
-          <w:i/>
-        </w:rPr>
-        <w:t xml:space="preserve"> </w:t>
-      </w:r>
-      <w:r>
-        <w:rPr>
-          <w:iCs/>
-          <w:i/>
-        </w:rPr>
-        <w:t xml:space="preserve">and Legacies</w:t>
-      </w:r>
-      <w:r>
-        <w:t xml:space="preserve">, edited by Leslie M. Harris et al., Universtiy of Georgia Press, 2019, pp. 224–50.</w:t>
-      </w:r>
-    </w:p>
-    <w:bookmarkEnd w:id="47"/>
-    <w:bookmarkStart w:id="49" w:name="X15bf6e91eeb3477b474d09d1932d48074d2ef6b"/>
-    <w:p>
-      <w:pPr>
-        <w:pStyle w:val="Bibliography"/>
-      </w:pPr>
-      <w:r>
         <w:t xml:space="preserve">Bernhardsson, Sebastian, et al.</w:t>
       </w:r>
       <w:r>
@@ -4040,7 +3932,7 @@
       <w:r>
         <w:t xml:space="preserve">, vol. 11, no. 12, Dec. 2009, p. 123015, doi:</w:t>
       </w:r>
-      <w:hyperlink r:id="rId48">
+      <w:hyperlink r:id="rId47">
         <w:r>
           <w:rPr>
             <w:rStyle w:val="Hyperlink"/>
@@ -4052,77 +3944,159 @@
         <w:t xml:space="preserve">.</w:t>
       </w:r>
     </w:p>
+    <w:bookmarkEnd w:id="48"/>
+    <w:bookmarkStart w:id="49" w:name="ref-blotnerFaulknerBiography2005b"/>
+    <w:p>
+      <w:pPr>
+        <w:pStyle w:val="Bibliography"/>
+      </w:pPr>
+      <w:r>
+        <w:t xml:space="preserve">Blotner, Joseph.</w:t>
+      </w:r>
+      <w:r>
+        <w:t xml:space="preserve"> </w:t>
+      </w:r>
+      <w:r>
+        <w:rPr>
+          <w:iCs/>
+          <w:i/>
+        </w:rPr>
+        <w:t xml:space="preserve">Faulkner:</w:t>
+      </w:r>
+      <w:r>
+        <w:rPr>
+          <w:iCs/>
+          <w:i/>
+        </w:rPr>
+        <w:t xml:space="preserve"> </w:t>
+      </w:r>
+      <w:r>
+        <w:rPr>
+          <w:iCs/>
+          <w:i/>
+        </w:rPr>
+        <w:t xml:space="preserve">A</w:t>
+      </w:r>
+      <w:r>
+        <w:rPr>
+          <w:iCs/>
+          <w:i/>
+        </w:rPr>
+        <w:t xml:space="preserve"> </w:t>
+      </w:r>
+      <w:r>
+        <w:rPr>
+          <w:iCs/>
+          <w:i/>
+        </w:rPr>
+        <w:t xml:space="preserve">Biography</w:t>
+      </w:r>
+      <w:r>
+        <w:t xml:space="preserve">. One-volume ed, University Press of Mississippi, 2005.</w:t>
+      </w:r>
+    </w:p>
     <w:bookmarkEnd w:id="49"/>
-    <w:bookmarkStart w:id="50" w:name="ref-blotnerFaulknerBiography2005b"/>
+    <w:bookmarkStart w:id="50" w:name="ref-RN31"/>
     <w:p>
       <w:pPr>
         <w:pStyle w:val="Bibliography"/>
       </w:pPr>
       <w:r>
-        <w:t xml:space="preserve">Blotner, Joseph.</w:t>
-      </w:r>
-      <w:r>
-        <w:t xml:space="preserve"> </w:t>
-      </w:r>
-      <w:r>
-        <w:rPr>
-          <w:iCs/>
-          <w:i/>
-        </w:rPr>
-        <w:t xml:space="preserve">Faulkner:</w:t>
-      </w:r>
-      <w:r>
-        <w:rPr>
-          <w:iCs/>
-          <w:i/>
-        </w:rPr>
-        <w:t xml:space="preserve"> </w:t>
-      </w:r>
-      <w:r>
-        <w:rPr>
-          <w:iCs/>
-          <w:i/>
-        </w:rPr>
-        <w:t xml:space="preserve">A</w:t>
-      </w:r>
-      <w:r>
-        <w:rPr>
-          <w:iCs/>
-          <w:i/>
-        </w:rPr>
-        <w:t xml:space="preserve"> </w:t>
-      </w:r>
-      <w:r>
-        <w:rPr>
-          <w:iCs/>
-          <w:i/>
-        </w:rPr>
-        <w:t xml:space="preserve">Biography</w:t>
-      </w:r>
-      <w:r>
-        <w:t xml:space="preserve">. One-volume ed, University Press of Mississippi, 2005.</w:t>
+        <w:t xml:space="preserve">Brooks, Cleanth.</w:t>
+      </w:r>
+      <w:r>
+        <w:t xml:space="preserve"> </w:t>
+      </w:r>
+      <w:r>
+        <w:t xml:space="preserve">“The</w:t>
+      </w:r>
+      <w:r>
+        <w:t xml:space="preserve"> </w:t>
+      </w:r>
+      <w:r>
+        <w:t xml:space="preserve">Narrative</w:t>
+      </w:r>
+      <w:r>
+        <w:t xml:space="preserve"> </w:t>
+      </w:r>
+      <w:r>
+        <w:t xml:space="preserve">Structure</w:t>
+      </w:r>
+      <w:r>
+        <w:t xml:space="preserve"> </w:t>
+      </w:r>
+      <w:r>
+        <w:t xml:space="preserve">of</w:t>
+      </w:r>
+      <w:r>
+        <w:t xml:space="preserve"> </w:t>
+      </w:r>
+      <w:r>
+        <w:rPr>
+          <w:iCs/>
+          <w:i/>
+        </w:rPr>
+        <w:t xml:space="preserve">Absalom</w:t>
+      </w:r>
+      <w:r>
+        <w:rPr>
+          <w:iCs/>
+          <w:i/>
+        </w:rPr>
+        <w:t xml:space="preserve">,</w:t>
+      </w:r>
+      <w:r>
+        <w:rPr>
+          <w:iCs/>
+          <w:i/>
+        </w:rPr>
+        <w:t xml:space="preserve"> </w:t>
+      </w:r>
+      <w:r>
+        <w:rPr>
+          <w:iCs/>
+          <w:i/>
+        </w:rPr>
+        <w:t xml:space="preserve">Absalom</w:t>
+      </w:r>
+      <w:r>
+        <w:rPr>
+          <w:iCs/>
+          <w:i/>
+        </w:rPr>
+        <w:t xml:space="preserve">!</w:t>
+      </w:r>
+      <w:r>
+        <w:t xml:space="preserve">”</w:t>
+      </w:r>
+      <w:r>
+        <w:t xml:space="preserve"> </w:t>
+      </w:r>
+      <w:r>
+        <w:rPr>
+          <w:iCs/>
+          <w:i/>
+        </w:rPr>
+        <w:t xml:space="preserve">The Georgia Review</w:t>
+      </w:r>
+      <w:r>
+        <w:t xml:space="preserve">, vol. 29, no. 2, 1975, pp. 366–94.</w:t>
       </w:r>
     </w:p>
     <w:bookmarkEnd w:id="50"/>
-    <w:bookmarkStart w:id="51" w:name="ref-RN31"/>
+    <w:bookmarkStart w:id="52" w:name="ref-burgersNarrativeStructureAnalysis"/>
     <w:p>
       <w:pPr>
         <w:pStyle w:val="Bibliography"/>
       </w:pPr>
       <w:r>
-        <w:t xml:space="preserve">Brooks, Cleanth.</w:t>
-      </w:r>
-      <w:r>
-        <w:t xml:space="preserve"> </w:t>
-      </w:r>
-      <w:r>
-        <w:t xml:space="preserve">“The</w:t>
-      </w:r>
-      <w:r>
-        <w:t xml:space="preserve"> </w:t>
-      </w:r>
-      <w:r>
-        <w:t xml:space="preserve">Narrative</w:t>
+        <w:t xml:space="preserve">Burgers, Johannes.</w:t>
+      </w:r>
+      <w:r>
+        <w:t xml:space="preserve"> </w:t>
+      </w:r>
+      <w:r>
+        <w:t xml:space="preserve">“Narrative</w:t>
       </w:r>
       <w:r>
         <w:t xml:space="preserve"> </w:t>
@@ -4134,110 +4108,28 @@
         <w:t xml:space="preserve"> </w:t>
       </w:r>
       <w:r>
-        <w:t xml:space="preserve">of</w:t>
-      </w:r>
-      <w:r>
-        <w:t xml:space="preserve"> </w:t>
-      </w:r>
-      <w:r>
-        <w:rPr>
-          <w:iCs/>
-          <w:i/>
-        </w:rPr>
-        <w:t xml:space="preserve">Absalom</w:t>
-      </w:r>
-      <w:r>
-        <w:rPr>
-          <w:iCs/>
-          <w:i/>
-        </w:rPr>
+        <w:t xml:space="preserve">Analysis</w:t>
+      </w:r>
+      <w:r>
+        <w:t xml:space="preserve">.”</w:t>
+      </w:r>
+      <w:r>
+        <w:t xml:space="preserve"> </w:t>
+      </w:r>
+      <w:r>
+        <w:rPr>
+          <w:iCs/>
+          <w:i/>
+        </w:rPr>
+        <w:t xml:space="preserve">Digital Yoknapatawpha</w:t>
+      </w:r>
+      <w:r>
         <w:t xml:space="preserve">,</w:t>
       </w:r>
       <w:r>
-        <w:rPr>
-          <w:iCs/>
-          <w:i/>
-        </w:rPr>
-        <w:t xml:space="preserve"> </w:t>
-      </w:r>
-      <w:r>
-        <w:rPr>
-          <w:iCs/>
-          <w:i/>
-        </w:rPr>
-        <w:t xml:space="preserve">Absalom</w:t>
-      </w:r>
-      <w:r>
-        <w:rPr>
-          <w:iCs/>
-          <w:i/>
-        </w:rPr>
-        <w:t xml:space="preserve">!</w:t>
-      </w:r>
-      <w:r>
-        <w:t xml:space="preserve">”</w:t>
-      </w:r>
-      <w:r>
-        <w:t xml:space="preserve"> </w:t>
-      </w:r>
-      <w:r>
-        <w:rPr>
-          <w:iCs/>
-          <w:i/>
-        </w:rPr>
-        <w:t xml:space="preserve">The Georgia Review</w:t>
-      </w:r>
-      <w:r>
-        <w:t xml:space="preserve">, vol. 29, no. 2, 1975, pp. 366–94.</w:t>
-      </w:r>
-    </w:p>
-    <w:bookmarkEnd w:id="51"/>
-    <w:bookmarkStart w:id="53" w:name="ref-burgersNarrativeStructureAnalysis"/>
-    <w:p>
-      <w:pPr>
-        <w:pStyle w:val="Bibliography"/>
-      </w:pPr>
-      <w:r>
-        <w:t xml:space="preserve">Burgers, Johannes.</w:t>
-      </w:r>
-      <w:r>
-        <w:t xml:space="preserve"> </w:t>
-      </w:r>
-      <w:r>
-        <w:t xml:space="preserve">“Narrative</w:t>
-      </w:r>
-      <w:r>
-        <w:t xml:space="preserve"> </w:t>
-      </w:r>
-      <w:r>
-        <w:t xml:space="preserve">Structure</w:t>
-      </w:r>
-      <w:r>
-        <w:t xml:space="preserve"> </w:t>
-      </w:r>
-      <w:r>
-        <w:t xml:space="preserve">Analysis</w:t>
-      </w:r>
-      <w:r>
-        <w:t xml:space="preserve">.”</w:t>
-      </w:r>
-      <w:r>
-        <w:t xml:space="preserve"> </w:t>
-      </w:r>
-      <w:r>
-        <w:rPr>
-          <w:iCs/>
-          <w:i/>
-        </w:rPr>
-        <w:t xml:space="preserve">Digital Yoknapatawpha</w:t>
-      </w:r>
-      <w:r>
-        <w:t xml:space="preserve">,</w:t>
-      </w:r>
-      <w:r>
-        <w:t xml:space="preserve"> </w:t>
-      </w:r>
-      <w:hyperlink r:id="rId52">
+        <w:t xml:space="preserve"> </w:t>
+      </w:r>
+      <w:hyperlink r:id="rId51">
         <w:r>
           <w:rPr>
             <w:rStyle w:val="Hyperlink"/>
@@ -4249,8 +4141,8 @@
         <w:t xml:space="preserve">. Accessed 5 June 2021.</w:t>
       </w:r>
     </w:p>
-    <w:bookmarkEnd w:id="53"/>
-    <w:bookmarkStart w:id="55" w:name="ref-chacomaHeapsLawHeaps"/>
+    <w:bookmarkEnd w:id="52"/>
+    <w:bookmarkStart w:id="54" w:name="ref-chacomaHeapsLawHeaps"/>
     <w:p>
       <w:pPr>
         <w:pStyle w:val="Bibliography"/>
@@ -4301,7 +4193,7 @@
       <w:r>
         <w:t xml:space="preserve">, vol. 7, no. 3, p. 200008, doi:</w:t>
       </w:r>
-      <w:hyperlink r:id="rId54">
+      <w:hyperlink r:id="rId53">
         <w:r>
           <w:rPr>
             <w:rStyle w:val="Hyperlink"/>
@@ -4313,8 +4205,8 @@
         <w:t xml:space="preserve">. Accessed 5 June 2021.</w:t>
       </w:r>
     </w:p>
-    <w:bookmarkEnd w:id="55"/>
-    <w:bookmarkStart w:id="57" w:name="ref-RN29"/>
+    <w:bookmarkEnd w:id="54"/>
+    <w:bookmarkStart w:id="56" w:name="ref-RN29"/>
     <w:p>
       <w:pPr>
         <w:pStyle w:val="Bibliography"/>
@@ -4341,7 +4233,7 @@
       <w:r>
         <w:t xml:space="preserve">, vol. 55, no. 2, 1983, pp. 199–214, doi:</w:t>
       </w:r>
-      <w:hyperlink r:id="rId56">
+      <w:hyperlink r:id="rId55">
         <w:r>
           <w:rPr>
             <w:rStyle w:val="Hyperlink"/>
@@ -4353,199 +4245,322 @@
         <w:t xml:space="preserve">.</w:t>
       </w:r>
     </w:p>
+    <w:bookmarkEnd w:id="56"/>
+    <w:bookmarkStart w:id="57" w:name="ref-RN35"/>
+    <w:p>
+      <w:pPr>
+        <w:pStyle w:val="Bibliography"/>
+      </w:pPr>
+      <w:r>
+        <w:t xml:space="preserve">Fargnoli, A. Nicholas, and Michael Golay.</w:t>
+      </w:r>
+      <w:r>
+        <w:t xml:space="preserve"> </w:t>
+      </w:r>
+      <w:r>
+        <w:rPr>
+          <w:iCs/>
+          <w:i/>
+        </w:rPr>
+        <w:t xml:space="preserve">Critical Companion to William Faulkner</w:t>
+      </w:r>
+      <w:r>
+        <w:t xml:space="preserve">. Facts On File, Incorporated, 2009.</w:t>
+      </w:r>
+    </w:p>
     <w:bookmarkEnd w:id="57"/>
-    <w:bookmarkStart w:id="59" w:name="ref-RN35"/>
+    <w:bookmarkStart w:id="58" w:name="ref-RN23"/>
     <w:p>
       <w:pPr>
         <w:pStyle w:val="Bibliography"/>
       </w:pPr>
       <w:r>
-        <w:t xml:space="preserve">Fargnoli, A. Nicholas, and Michael Golay.</w:t>
-      </w:r>
-      <w:r>
-        <w:t xml:space="preserve"> </w:t>
-      </w:r>
-      <w:r>
-        <w:rPr>
-          <w:iCs/>
-          <w:i/>
-        </w:rPr>
-        <w:t xml:space="preserve">Critical Companion to William Faulkner</w:t>
-      </w:r>
-      <w:r>
-        <w:t xml:space="preserve">. Facts On File, Incorporated, 2009,</w:t>
-      </w:r>
-      <w:r>
-        <w:t xml:space="preserve"> </w:t>
-      </w:r>
-      <w:hyperlink r:id="rId58">
-        <w:r>
-          <w:rPr>
-            <w:rStyle w:val="Hyperlink"/>
-          </w:rPr>
-          <w:t xml:space="preserve">https://books.google.co.in/books?id=dQca8cin24gC</w:t>
-        </w:r>
-      </w:hyperlink>
-      <w:r>
-        <w:t xml:space="preserve">.</w:t>
+        <w:t xml:space="preserve">Faulkner, William.</w:t>
+      </w:r>
+      <w:r>
+        <w:t xml:space="preserve"> </w:t>
+      </w:r>
+      <w:r>
+        <w:rPr>
+          <w:iCs/>
+          <w:i/>
+        </w:rPr>
+        <w:t xml:space="preserve">Absalom, Absalom!:</w:t>
+      </w:r>
+      <w:r>
+        <w:rPr>
+          <w:iCs/>
+          <w:i/>
+        </w:rPr>
+        <w:t xml:space="preserve"> </w:t>
+      </w:r>
+      <w:r>
+        <w:rPr>
+          <w:iCs/>
+          <w:i/>
+        </w:rPr>
+        <w:t xml:space="preserve">The</w:t>
+      </w:r>
+      <w:r>
+        <w:rPr>
+          <w:iCs/>
+          <w:i/>
+        </w:rPr>
+        <w:t xml:space="preserve"> </w:t>
+      </w:r>
+      <w:r>
+        <w:rPr>
+          <w:iCs/>
+          <w:i/>
+        </w:rPr>
+        <w:t xml:space="preserve">Corrected Text</w:t>
+      </w:r>
+      <w:r>
+        <w:t xml:space="preserve">. Vintage Books, 1990.</w:t>
+      </w:r>
+    </w:p>
+    <w:bookmarkEnd w:id="58"/>
+    <w:bookmarkStart w:id="59" w:name="ref-faulknerFaulknerUniversityClass1965"/>
+    <w:p>
+      <w:pPr>
+        <w:pStyle w:val="Bibliography"/>
+      </w:pPr>
+      <w:r>
+        <w:t xml:space="preserve">---.</w:t>
+      </w:r>
+      <w:r>
+        <w:t xml:space="preserve"> </w:t>
+      </w:r>
+      <w:r>
+        <w:rPr>
+          <w:iCs/>
+          <w:i/>
+        </w:rPr>
+        <w:t xml:space="preserve">Faulkner in the</w:t>
+      </w:r>
+      <w:r>
+        <w:rPr>
+          <w:iCs/>
+          <w:i/>
+        </w:rPr>
+        <w:t xml:space="preserve"> </w:t>
+      </w:r>
+      <w:r>
+        <w:rPr>
+          <w:iCs/>
+          <w:i/>
+        </w:rPr>
+        <w:t xml:space="preserve">University</w:t>
+      </w:r>
+      <w:r>
+        <w:rPr>
+          <w:iCs/>
+          <w:i/>
+        </w:rPr>
+        <w:t xml:space="preserve">:</w:t>
+      </w:r>
+      <w:r>
+        <w:rPr>
+          <w:iCs/>
+          <w:i/>
+        </w:rPr>
+        <w:t xml:space="preserve"> </w:t>
+      </w:r>
+      <w:r>
+        <w:rPr>
+          <w:iCs/>
+          <w:i/>
+        </w:rPr>
+        <w:t xml:space="preserve">Class</w:t>
+      </w:r>
+      <w:r>
+        <w:rPr>
+          <w:iCs/>
+          <w:i/>
+        </w:rPr>
+        <w:t xml:space="preserve"> </w:t>
+      </w:r>
+      <w:r>
+        <w:rPr>
+          <w:iCs/>
+          <w:i/>
+        </w:rPr>
+        <w:t xml:space="preserve">Conferences</w:t>
+      </w:r>
+      <w:r>
+        <w:rPr>
+          <w:iCs/>
+          <w:i/>
+        </w:rPr>
+        <w:t xml:space="preserve"> </w:t>
+      </w:r>
+      <w:r>
+        <w:rPr>
+          <w:iCs/>
+          <w:i/>
+        </w:rPr>
+        <w:t xml:space="preserve">at the</w:t>
+      </w:r>
+      <w:r>
+        <w:rPr>
+          <w:iCs/>
+          <w:i/>
+        </w:rPr>
+        <w:t xml:space="preserve"> </w:t>
+      </w:r>
+      <w:r>
+        <w:rPr>
+          <w:iCs/>
+          <w:i/>
+        </w:rPr>
+        <w:t xml:space="preserve">University</w:t>
+      </w:r>
+      <w:r>
+        <w:rPr>
+          <w:iCs/>
+          <w:i/>
+        </w:rPr>
+        <w:t xml:space="preserve"> </w:t>
+      </w:r>
+      <w:r>
+        <w:rPr>
+          <w:iCs/>
+          <w:i/>
+        </w:rPr>
+        <w:t xml:space="preserve">of</w:t>
+      </w:r>
+      <w:r>
+        <w:rPr>
+          <w:iCs/>
+          <w:i/>
+        </w:rPr>
+        <w:t xml:space="preserve"> </w:t>
+      </w:r>
+      <w:r>
+        <w:rPr>
+          <w:iCs/>
+          <w:i/>
+        </w:rPr>
+        <w:t xml:space="preserve">Virginia</w:t>
+      </w:r>
+      <w:r>
+        <w:rPr>
+          <w:iCs/>
+          <w:i/>
+        </w:rPr>
+        <w:t xml:space="preserve">, 1957-1958</w:t>
+      </w:r>
+      <w:r>
+        <w:t xml:space="preserve">. Vintage Books, 1965.</w:t>
       </w:r>
     </w:p>
     <w:bookmarkEnd w:id="59"/>
-    <w:bookmarkStart w:id="60" w:name="ref-faulknerFaulknerUniversityClass1965"/>
+    <w:bookmarkStart w:id="60" w:name="ref-forsterAspectsNovel1927"/>
     <w:p>
       <w:pPr>
         <w:pStyle w:val="Bibliography"/>
       </w:pPr>
       <w:r>
-        <w:t xml:space="preserve">Faulkner, William.</w:t>
-      </w:r>
-      <w:r>
-        <w:t xml:space="preserve"> </w:t>
-      </w:r>
-      <w:r>
-        <w:rPr>
-          <w:iCs/>
-          <w:i/>
-        </w:rPr>
-        <w:t xml:space="preserve">Faulkner in the</w:t>
-      </w:r>
-      <w:r>
-        <w:rPr>
-          <w:iCs/>
-          <w:i/>
-        </w:rPr>
-        <w:t xml:space="preserve"> </w:t>
-      </w:r>
-      <w:r>
-        <w:rPr>
-          <w:iCs/>
-          <w:i/>
-        </w:rPr>
-        <w:t xml:space="preserve">University</w:t>
-      </w:r>
-      <w:r>
-        <w:rPr>
-          <w:iCs/>
-          <w:i/>
-        </w:rPr>
+        <w:t xml:space="preserve">Forster, E. M., and Harcourt Brace &amp; Company.</w:t>
+      </w:r>
+      <w:r>
+        <w:t xml:space="preserve"> </w:t>
+      </w:r>
+      <w:r>
+        <w:rPr>
+          <w:iCs/>
+          <w:i/>
+        </w:rPr>
+        <w:t xml:space="preserve">Aspects of the Novel</w:t>
+      </w:r>
+      <w:r>
+        <w:t xml:space="preserve">. 1927.</w:t>
+      </w:r>
+    </w:p>
+    <w:bookmarkEnd w:id="60"/>
+    <w:bookmarkStart w:id="61" w:name="ref-goddenAbsalomAbsalomHaiti1994"/>
+    <w:p>
+      <w:pPr>
+        <w:pStyle w:val="Bibliography"/>
+      </w:pPr>
+      <w:r>
+        <w:t xml:space="preserve">Godden, Richard.</w:t>
+      </w:r>
+      <w:r>
+        <w:t xml:space="preserve"> </w:t>
+      </w:r>
+      <w:r>
+        <w:t xml:space="preserve">“Absalom,</w:t>
+      </w:r>
+      <w:r>
+        <w:t xml:space="preserve"> </w:t>
+      </w:r>
+      <w:r>
+        <w:t xml:space="preserve">Absalom</w:t>
+      </w:r>
+      <w:r>
+        <w:t xml:space="preserve">!,</w:t>
+      </w:r>
+      <w:r>
+        <w:t xml:space="preserve"> </w:t>
+      </w:r>
+      <w:r>
+        <w:t xml:space="preserve">Haiti</w:t>
+      </w:r>
+      <w:r>
+        <w:t xml:space="preserve"> </w:t>
+      </w:r>
+      <w:r>
+        <w:t xml:space="preserve">and</w:t>
+      </w:r>
+      <w:r>
+        <w:t xml:space="preserve"> </w:t>
+      </w:r>
+      <w:r>
+        <w:t xml:space="preserve">Labor</w:t>
+      </w:r>
+      <w:r>
+        <w:t xml:space="preserve"> </w:t>
+      </w:r>
+      <w:r>
+        <w:t xml:space="preserve">History</w:t>
+      </w:r>
+      <w:r>
         <w:t xml:space="preserve">:</w:t>
       </w:r>
       <w:r>
-        <w:rPr>
-          <w:iCs/>
-          <w:i/>
-        </w:rPr>
-        <w:t xml:space="preserve"> </w:t>
-      </w:r>
-      <w:r>
-        <w:rPr>
-          <w:iCs/>
-          <w:i/>
-        </w:rPr>
-        <w:t xml:space="preserve">Class</w:t>
-      </w:r>
-      <w:r>
-        <w:rPr>
-          <w:iCs/>
-          <w:i/>
-        </w:rPr>
-        <w:t xml:space="preserve"> </w:t>
-      </w:r>
-      <w:r>
-        <w:rPr>
-          <w:iCs/>
-          <w:i/>
-        </w:rPr>
-        <w:t xml:space="preserve">Conferences</w:t>
-      </w:r>
-      <w:r>
-        <w:rPr>
-          <w:iCs/>
-          <w:i/>
-        </w:rPr>
-        <w:t xml:space="preserve"> </w:t>
-      </w:r>
-      <w:r>
-        <w:rPr>
-          <w:iCs/>
-          <w:i/>
-        </w:rPr>
-        <w:t xml:space="preserve">at the</w:t>
-      </w:r>
-      <w:r>
-        <w:rPr>
-          <w:iCs/>
-          <w:i/>
-        </w:rPr>
-        <w:t xml:space="preserve"> </w:t>
-      </w:r>
-      <w:r>
-        <w:rPr>
-          <w:iCs/>
-          <w:i/>
-        </w:rPr>
-        <w:t xml:space="preserve">University</w:t>
-      </w:r>
-      <w:r>
-        <w:rPr>
-          <w:iCs/>
-          <w:i/>
-        </w:rPr>
-        <w:t xml:space="preserve"> </w:t>
-      </w:r>
-      <w:r>
-        <w:rPr>
-          <w:iCs/>
-          <w:i/>
-        </w:rPr>
-        <w:t xml:space="preserve">of</w:t>
-      </w:r>
-      <w:r>
-        <w:rPr>
-          <w:iCs/>
-          <w:i/>
-        </w:rPr>
-        <w:t xml:space="preserve"> </w:t>
-      </w:r>
-      <w:r>
-        <w:rPr>
-          <w:iCs/>
-          <w:i/>
-        </w:rPr>
-        <w:t xml:space="preserve">Virginia</w:t>
-      </w:r>
-      <w:r>
-        <w:rPr>
-          <w:iCs/>
-          <w:i/>
-        </w:rPr>
-        <w:t xml:space="preserve">, 1957-1958</w:t>
-      </w:r>
-      <w:r>
-        <w:t xml:space="preserve">. Vintage Books, 1965.</w:t>
-      </w:r>
-    </w:p>
-    <w:bookmarkEnd w:id="60"/>
-    <w:bookmarkStart w:id="61" w:name="ref-forsterAspectsNovel1927"/>
-    <w:p>
-      <w:pPr>
-        <w:pStyle w:val="Bibliography"/>
-      </w:pPr>
-      <w:r>
-        <w:t xml:space="preserve">Forster, E. M., and Harcourt Brace &amp; Company.</w:t>
-      </w:r>
-      <w:r>
-        <w:t xml:space="preserve"> </w:t>
-      </w:r>
-      <w:r>
-        <w:rPr>
-          <w:iCs/>
-          <w:i/>
-        </w:rPr>
-        <w:t xml:space="preserve">Aspects of the Novel</w:t>
-      </w:r>
-      <w:r>
-        <w:t xml:space="preserve">. 1927.</w:t>
+        <w:t xml:space="preserve"> </w:t>
+      </w:r>
+      <w:r>
+        <w:t xml:space="preserve">Reading</w:t>
+      </w:r>
+      <w:r>
+        <w:t xml:space="preserve"> </w:t>
+      </w:r>
+      <w:r>
+        <w:t xml:space="preserve">Unreadable</w:t>
+      </w:r>
+      <w:r>
+        <w:t xml:space="preserve"> </w:t>
+      </w:r>
+      <w:r>
+        <w:t xml:space="preserve">Revolutions</w:t>
+      </w:r>
+      <w:r>
+        <w:t xml:space="preserve">.”</w:t>
+      </w:r>
+      <w:r>
+        <w:t xml:space="preserve"> </w:t>
+      </w:r>
+      <w:r>
+        <w:rPr>
+          <w:iCs/>
+          <w:i/>
+        </w:rPr>
+        <w:t xml:space="preserve">ELH</w:t>
+      </w:r>
+      <w:r>
+        <w:t xml:space="preserve">, vol. 61, no. 3, 1994, pp. 685–720.</w:t>
       </w:r>
     </w:p>
     <w:bookmarkEnd w:id="61"/>
@@ -4862,12 +4877,95 @@
       </w:r>
     </w:p>
     <w:bookmarkEnd w:id="65"/>
-    <w:bookmarkStart w:id="66" w:name="ref-RN34"/>
+    <w:bookmarkStart w:id="66" w:name="ref-matthewsRecallingWestIndies2004"/>
     <w:p>
       <w:pPr>
         <w:pStyle w:val="Bibliography"/>
       </w:pPr>
       <w:r>
+        <w:t xml:space="preserve">Matthews, John T.</w:t>
+      </w:r>
+      <w:r>
+        <w:t xml:space="preserve"> </w:t>
+      </w:r>
+      <w:r>
+        <w:t xml:space="preserve">“Recalling the</w:t>
+      </w:r>
+      <w:r>
+        <w:t xml:space="preserve"> </w:t>
+      </w:r>
+      <w:r>
+        <w:t xml:space="preserve">West</w:t>
+      </w:r>
+      <w:r>
+        <w:t xml:space="preserve"> </w:t>
+      </w:r>
+      <w:r>
+        <w:t xml:space="preserve">Indies</w:t>
+      </w:r>
+      <w:r>
+        <w:t xml:space="preserve">:</w:t>
+      </w:r>
+      <w:r>
+        <w:t xml:space="preserve"> </w:t>
+      </w:r>
+      <w:r>
+        <w:t xml:space="preserve">From</w:t>
+      </w:r>
+      <w:r>
+        <w:t xml:space="preserve"> </w:t>
+      </w:r>
+      <w:r>
+        <w:t xml:space="preserve">Yoknapatawpha</w:t>
+      </w:r>
+      <w:r>
+        <w:t xml:space="preserve"> </w:t>
+      </w:r>
+      <w:r>
+        <w:t xml:space="preserve">to</w:t>
+      </w:r>
+      <w:r>
+        <w:t xml:space="preserve"> </w:t>
+      </w:r>
+      <w:r>
+        <w:t xml:space="preserve">Haiti</w:t>
+      </w:r>
+      <w:r>
+        <w:t xml:space="preserve"> </w:t>
+      </w:r>
+      <w:r>
+        <w:t xml:space="preserve">and</w:t>
+      </w:r>
+      <w:r>
+        <w:t xml:space="preserve"> </w:t>
+      </w:r>
+      <w:r>
+        <w:t xml:space="preserve">Back</w:t>
+      </w:r>
+      <w:r>
+        <w:t xml:space="preserve">.”</w:t>
+      </w:r>
+      <w:r>
+        <w:t xml:space="preserve"> </w:t>
+      </w:r>
+      <w:r>
+        <w:rPr>
+          <w:iCs/>
+          <w:i/>
+        </w:rPr>
+        <w:t xml:space="preserve">American Literary History</w:t>
+      </w:r>
+      <w:r>
+        <w:t xml:space="preserve">, vol. 16, no. 2, 2004, pp. 238–62.</w:t>
+      </w:r>
+    </w:p>
+    <w:bookmarkEnd w:id="66"/>
+    <w:bookmarkStart w:id="67" w:name="ref-RN34"/>
+    <w:p>
+      <w:pPr>
+        <w:pStyle w:val="Bibliography"/>
+      </w:pPr>
+      <w:r>
         <w:t xml:space="preserve">McWhirter, Norris.</w:t>
       </w:r>
       <w:r>
@@ -4884,8 +4982,8 @@
         <w:t xml:space="preserve">. Bantam Books, 1983.</w:t>
       </w:r>
     </w:p>
-    <w:bookmarkEnd w:id="66"/>
-    <w:bookmarkStart w:id="67" w:name="ref-pinkerLanguageInstinctHow1995"/>
+    <w:bookmarkEnd w:id="67"/>
+    <w:bookmarkStart w:id="68" w:name="ref-pinkerLanguageInstinctHow1995"/>
     <w:p>
       <w:pPr>
         <w:pStyle w:val="Bibliography"/>
@@ -5012,8 +5110,8 @@
         <w:t xml:space="preserve">. Harper Collins, 1995.</w:t>
       </w:r>
     </w:p>
-    <w:bookmarkEnd w:id="67"/>
-    <w:bookmarkStart w:id="68" w:name="ref-RN27"/>
+    <w:bookmarkEnd w:id="68"/>
+    <w:bookmarkStart w:id="69" w:name="ref-RN27"/>
     <w:p>
       <w:pPr>
         <w:pStyle w:val="Bibliography"/>
@@ -5095,13 +5193,327 @@
         <w:t xml:space="preserve">, vol. 49, 2016, pp. 101–21.</w:t>
       </w:r>
     </w:p>
-    <w:bookmarkEnd w:id="68"/>
-    <w:bookmarkStart w:id="69" w:name="ref-RN24"/>
+    <w:bookmarkEnd w:id="69"/>
+    <w:bookmarkStart w:id="70" w:name="ref-raileyNaturalAristocracyHistory1999b"/>
     <w:p>
       <w:pPr>
         <w:pStyle w:val="Bibliography"/>
       </w:pPr>
       <w:r>
+        <w:t xml:space="preserve">Railey, Kevin.</w:t>
+      </w:r>
+      <w:r>
+        <w:t xml:space="preserve"> </w:t>
+      </w:r>
+      <w:r>
+        <w:rPr>
+          <w:iCs/>
+          <w:i/>
+        </w:rPr>
+        <w:t xml:space="preserve">Natural</w:t>
+      </w:r>
+      <w:r>
+        <w:rPr>
+          <w:iCs/>
+          <w:i/>
+        </w:rPr>
+        <w:t xml:space="preserve"> </w:t>
+      </w:r>
+      <w:r>
+        <w:rPr>
+          <w:iCs/>
+          <w:i/>
+        </w:rPr>
+        <w:t xml:space="preserve">Aristocracy</w:t>
+      </w:r>
+      <w:r>
+        <w:rPr>
+          <w:iCs/>
+          <w:i/>
+        </w:rPr>
+        <w:t xml:space="preserve">:</w:t>
+      </w:r>
+      <w:r>
+        <w:rPr>
+          <w:iCs/>
+          <w:i/>
+        </w:rPr>
+        <w:t xml:space="preserve"> </w:t>
+      </w:r>
+      <w:r>
+        <w:rPr>
+          <w:iCs/>
+          <w:i/>
+        </w:rPr>
+        <w:t xml:space="preserve">History</w:t>
+      </w:r>
+      <w:r>
+        <w:rPr>
+          <w:iCs/>
+          <w:i/>
+        </w:rPr>
+        <w:t xml:space="preserve">,</w:t>
+      </w:r>
+      <w:r>
+        <w:rPr>
+          <w:iCs/>
+          <w:i/>
+        </w:rPr>
+        <w:t xml:space="preserve"> </w:t>
+      </w:r>
+      <w:r>
+        <w:rPr>
+          <w:iCs/>
+          <w:i/>
+        </w:rPr>
+        <w:t xml:space="preserve">Ideology</w:t>
+      </w:r>
+      <w:r>
+        <w:rPr>
+          <w:iCs/>
+          <w:i/>
+        </w:rPr>
+        <w:t xml:space="preserve">, and the</w:t>
+      </w:r>
+      <w:r>
+        <w:rPr>
+          <w:iCs/>
+          <w:i/>
+        </w:rPr>
+        <w:t xml:space="preserve"> </w:t>
+      </w:r>
+      <w:r>
+        <w:rPr>
+          <w:iCs/>
+          <w:i/>
+        </w:rPr>
+        <w:t xml:space="preserve">Production</w:t>
+      </w:r>
+      <w:r>
+        <w:rPr>
+          <w:iCs/>
+          <w:i/>
+        </w:rPr>
+        <w:t xml:space="preserve"> </w:t>
+      </w:r>
+      <w:r>
+        <w:rPr>
+          <w:iCs/>
+          <w:i/>
+        </w:rPr>
+        <w:t xml:space="preserve">of</w:t>
+      </w:r>
+      <w:r>
+        <w:rPr>
+          <w:iCs/>
+          <w:i/>
+        </w:rPr>
+        <w:t xml:space="preserve"> </w:t>
+      </w:r>
+      <w:r>
+        <w:rPr>
+          <w:iCs/>
+          <w:i/>
+        </w:rPr>
+        <w:t xml:space="preserve">William</w:t>
+      </w:r>
+      <w:r>
+        <w:rPr>
+          <w:iCs/>
+          <w:i/>
+        </w:rPr>
+        <w:t xml:space="preserve"> </w:t>
+      </w:r>
+      <w:r>
+        <w:rPr>
+          <w:iCs/>
+          <w:i/>
+        </w:rPr>
+        <w:t xml:space="preserve">Faulkner</w:t>
+      </w:r>
+      <w:r>
+        <w:t xml:space="preserve">. University of Alabama Press, 1999.</w:t>
+      </w:r>
+    </w:p>
+    <w:bookmarkEnd w:id="70"/>
+    <w:bookmarkStart w:id="72" w:name="ref-randelParenthesesFaulknerAbsalom1971"/>
+    <w:p>
+      <w:pPr>
+        <w:pStyle w:val="Bibliography"/>
+      </w:pPr>
+      <w:r>
+        <w:t xml:space="preserve">Randel, Fred V.</w:t>
+      </w:r>
+      <w:r>
+        <w:t xml:space="preserve"> </w:t>
+      </w:r>
+      <w:r>
+        <w:t xml:space="preserve">“Parentheses in</w:t>
+      </w:r>
+      <w:r>
+        <w:t xml:space="preserve"> </w:t>
+      </w:r>
+      <w:r>
+        <w:t xml:space="preserve">Faulkner</w:t>
+      </w:r>
+      <w:r>
+        <w:t xml:space="preserve">’s</w:t>
+      </w:r>
+      <w:r>
+        <w:t xml:space="preserve"> </w:t>
+      </w:r>
+      <w:r>
+        <w:rPr>
+          <w:iCs/>
+          <w:i/>
+        </w:rPr>
+        <w:t xml:space="preserve">Absalom</w:t>
+      </w:r>
+      <w:r>
+        <w:rPr>
+          <w:iCs/>
+          <w:i/>
+        </w:rPr>
+        <w:t xml:space="preserve">,</w:t>
+      </w:r>
+      <w:r>
+        <w:rPr>
+          <w:iCs/>
+          <w:i/>
+        </w:rPr>
+        <w:t xml:space="preserve"> </w:t>
+      </w:r>
+      <w:r>
+        <w:rPr>
+          <w:iCs/>
+          <w:i/>
+        </w:rPr>
+        <w:t xml:space="preserve">Absalom</w:t>
+      </w:r>
+      <w:r>
+        <w:rPr>
+          <w:iCs/>
+          <w:i/>
+        </w:rPr>
+        <w:t xml:space="preserve">!</w:t>
+      </w:r>
+      <w:r>
+        <w:t xml:space="preserve">”</w:t>
+      </w:r>
+      <w:r>
+        <w:t xml:space="preserve"> </w:t>
+      </w:r>
+      <w:r>
+        <w:rPr>
+          <w:iCs/>
+          <w:i/>
+        </w:rPr>
+        <w:t xml:space="preserve">Style</w:t>
+      </w:r>
+      <w:r>
+        <w:t xml:space="preserve">, vol. 5, no. 1, 1971, pp. 70–87,</w:t>
+      </w:r>
+      <w:r>
+        <w:t xml:space="preserve"> </w:t>
+      </w:r>
+      <w:hyperlink r:id="rId71">
+        <w:r>
+          <w:rPr>
+            <w:rStyle w:val="Hyperlink"/>
+          </w:rPr>
+          <w:t xml:space="preserve">http://www.jstor.org/stable/42945084</w:t>
+        </w:r>
+      </w:hyperlink>
+      <w:r>
+        <w:t xml:space="preserve">.</w:t>
+      </w:r>
+    </w:p>
+    <w:bookmarkEnd w:id="72"/>
+    <w:bookmarkStart w:id="74" w:name="Xd3029ae36e1025e3492eadd3ff75d2310d137a7"/>
+    <w:p>
+      <w:pPr>
+        <w:pStyle w:val="Bibliography"/>
+      </w:pPr>
+      <w:r>
+        <w:t xml:space="preserve">Rio-Jelliffe, R.</w:t>
+      </w:r>
+      <w:r>
+        <w:t xml:space="preserve"> </w:t>
+      </w:r>
+      <w:r>
+        <w:t xml:space="preserve">“"</w:t>
+      </w:r>
+      <w:r>
+        <w:t xml:space="preserve">Absalom</w:t>
+      </w:r>
+      <w:r>
+        <w:t xml:space="preserve">,</w:t>
+      </w:r>
+      <w:r>
+        <w:t xml:space="preserve"> </w:t>
+      </w:r>
+      <w:r>
+        <w:t xml:space="preserve">Absalom</w:t>
+      </w:r>
+      <w:r>
+        <w:t xml:space="preserve">!" As</w:t>
+      </w:r>
+      <w:r>
+        <w:t xml:space="preserve"> </w:t>
+      </w:r>
+      <w:r>
+        <w:t xml:space="preserve">Self</w:t>
+      </w:r>
+      <w:r>
+        <w:t xml:space="preserve">-</w:t>
+      </w:r>
+      <w:r>
+        <w:t xml:space="preserve">Reflexive</w:t>
+      </w:r>
+      <w:r>
+        <w:t xml:space="preserve"> </w:t>
+      </w:r>
+      <w:r>
+        <w:t xml:space="preserve">Novel</w:t>
+      </w:r>
+      <w:r>
+        <w:t xml:space="preserve">.”</w:t>
+      </w:r>
+      <w:r>
+        <w:t xml:space="preserve"> </w:t>
+      </w:r>
+      <w:r>
+        <w:rPr>
+          <w:iCs/>
+          <w:i/>
+        </w:rPr>
+        <w:t xml:space="preserve">The Journal of Narrative Technique</w:t>
+      </w:r>
+      <w:r>
+        <w:t xml:space="preserve">, vol. 11, no. 2, 1981, pp. 75–90,</w:t>
+      </w:r>
+      <w:r>
+        <w:t xml:space="preserve"> </w:t>
+      </w:r>
+      <w:hyperlink r:id="rId73">
+        <w:r>
+          <w:rPr>
+            <w:rStyle w:val="Hyperlink"/>
+          </w:rPr>
+          <w:t xml:space="preserve">http://www.jstor.org/stable/30225016</w:t>
+        </w:r>
+      </w:hyperlink>
+      <w:r>
+        <w:t xml:space="preserve">.</w:t>
+      </w:r>
+    </w:p>
+    <w:bookmarkEnd w:id="74"/>
+    <w:bookmarkStart w:id="75" w:name="ref-RN24"/>
+    <w:p>
+      <w:pPr>
+        <w:pStyle w:val="Bibliography"/>
+      </w:pPr>
+      <w:r>
         <w:t xml:space="preserve">Romano, Renee C.</w:t>
       </w:r>
       <w:r>
@@ -5223,8 +5635,8 @@
         <w:t xml:space="preserve">. Harvard University Press, 2009.</w:t>
       </w:r>
     </w:p>
-    <w:bookmarkEnd w:id="69"/>
-    <w:bookmarkStart w:id="70" w:name="ref-RN37"/>
+    <w:bookmarkEnd w:id="75"/>
+    <w:bookmarkStart w:id="76" w:name="ref-RN37"/>
     <w:p>
       <w:pPr>
         <w:pStyle w:val="Bibliography"/>
@@ -5400,8 +5812,8 @@
         <w:t xml:space="preserve">, edited by Richard J. Whitt, John Benjamins Publishing Company, 2018.</w:t>
       </w:r>
     </w:p>
-    <w:bookmarkEnd w:id="70"/>
-    <w:bookmarkStart w:id="71" w:name="ref-RN26"/>
+    <w:bookmarkEnd w:id="76"/>
+    <w:bookmarkStart w:id="77" w:name="ref-RN26"/>
     <w:p>
       <w:pPr>
         <w:pStyle w:val="Bibliography"/>
@@ -5570,8 +5982,8 @@
         <w:t xml:space="preserve">, edited by Werner Sollors, Oxford University Press, 2000, pp. xiii, 546 p.</w:t>
       </w:r>
     </w:p>
-    <w:bookmarkEnd w:id="71"/>
-    <w:bookmarkStart w:id="72" w:name="ref-shklovskiiTheoryProse1990"/>
+    <w:bookmarkEnd w:id="77"/>
+    <w:bookmarkStart w:id="78" w:name="ref-shklovskiiTheoryProse1990"/>
     <w:p>
       <w:pPr>
         <w:pStyle w:val="Bibliography"/>
@@ -5593,9 +6005,140 @@
         <w:t xml:space="preserve">. Translated by Benjamin Sher, Dalkey Archive Press, 1990.</w:t>
       </w:r>
     </w:p>
-    <w:bookmarkEnd w:id="72"/>
-    <w:bookmarkEnd w:id="73"/>
-    <w:bookmarkEnd w:id="74"/>
+    <w:bookmarkEnd w:id="78"/>
+    <w:bookmarkStart w:id="79" w:name="ref-stanchichHiddenCaribbeanOther1996"/>
+    <w:p>
+      <w:pPr>
+        <w:pStyle w:val="Bibliography"/>
+      </w:pPr>
+      <w:r>
+        <w:t xml:space="preserve">Stanchich, Maritza.</w:t>
+      </w:r>
+      <w:r>
+        <w:t xml:space="preserve"> </w:t>
+      </w:r>
+      <w:r>
+        <w:t xml:space="preserve">“The</w:t>
+      </w:r>
+      <w:r>
+        <w:t xml:space="preserve"> </w:t>
+      </w:r>
+      <w:r>
+        <w:t xml:space="preserve">Hidden</w:t>
+      </w:r>
+      <w:r>
+        <w:t xml:space="preserve"> </w:t>
+      </w:r>
+      <w:r>
+        <w:t xml:space="preserve">Caribbean</w:t>
+      </w:r>
+      <w:r>
+        <w:t xml:space="preserve"> </w:t>
+      </w:r>
+      <w:r>
+        <w:t xml:space="preserve">"</w:t>
+      </w:r>
+      <w:r>
+        <w:t xml:space="preserve">Other</w:t>
+      </w:r>
+      <w:r>
+        <w:t xml:space="preserve">" in</w:t>
+      </w:r>
+      <w:r>
+        <w:t xml:space="preserve"> </w:t>
+      </w:r>
+      <w:r>
+        <w:t xml:space="preserve">William</w:t>
+      </w:r>
+      <w:r>
+        <w:t xml:space="preserve"> </w:t>
+      </w:r>
+      <w:r>
+        <w:t xml:space="preserve">Faulkner</w:t>
+      </w:r>
+      <w:r>
+        <w:t xml:space="preserve">’s "</w:t>
+      </w:r>
+      <w:r>
+        <w:t xml:space="preserve">Absalom</w:t>
+      </w:r>
+      <w:r>
+        <w:t xml:space="preserve">,</w:t>
+      </w:r>
+      <w:r>
+        <w:t xml:space="preserve"> </w:t>
+      </w:r>
+      <w:r>
+        <w:t xml:space="preserve">Absalom</w:t>
+      </w:r>
+      <w:r>
+        <w:t xml:space="preserve">!":</w:t>
+      </w:r>
+      <w:r>
+        <w:t xml:space="preserve"> </w:t>
+      </w:r>
+      <w:r>
+        <w:t xml:space="preserve">An</w:t>
+      </w:r>
+      <w:r>
+        <w:t xml:space="preserve"> </w:t>
+      </w:r>
+      <w:r>
+        <w:t xml:space="preserve">Ideological</w:t>
+      </w:r>
+      <w:r>
+        <w:t xml:space="preserve"> </w:t>
+      </w:r>
+      <w:r>
+        <w:t xml:space="preserve">Ancestry</w:t>
+      </w:r>
+      <w:r>
+        <w:t xml:space="preserve"> </w:t>
+      </w:r>
+      <w:r>
+        <w:t xml:space="preserve">of</w:t>
+      </w:r>
+      <w:r>
+        <w:t xml:space="preserve"> </w:t>
+      </w:r>
+      <w:r>
+        <w:t xml:space="preserve">U</w:t>
+      </w:r>
+      <w:r>
+        <w:t xml:space="preserve">.</w:t>
+      </w:r>
+      <w:r>
+        <w:t xml:space="preserve">S</w:t>
+      </w:r>
+      <w:r>
+        <w:t xml:space="preserve">.</w:t>
+      </w:r>
+      <w:r>
+        <w:t xml:space="preserve"> </w:t>
+      </w:r>
+      <w:r>
+        <w:t xml:space="preserve">Imperialism</w:t>
+      </w:r>
+      <w:r>
+        <w:t xml:space="preserve">.”</w:t>
+      </w:r>
+      <w:r>
+        <w:t xml:space="preserve"> </w:t>
+      </w:r>
+      <w:r>
+        <w:rPr>
+          <w:iCs/>
+          <w:i/>
+        </w:rPr>
+        <w:t xml:space="preserve">The Mississippi Quarterly</w:t>
+      </w:r>
+      <w:r>
+        <w:t xml:space="preserve">, vol. 49, no. 3, 1996, pp. 603–17.</w:t>
+      </w:r>
+    </w:p>
+    <w:bookmarkEnd w:id="79"/>
+    <w:bookmarkEnd w:id="80"/>
+    <w:bookmarkEnd w:id="81"/>
     <w:sectPr>
       <w:pgSz w:w="12240" w:h="15840"/>
       <w:pgMar w:top="1440" w:right="1440" w:bottom="1440" w:left="1440" w:header="720" w:footer="720" w:gutter="0"/>
@@ -5728,14 +6271,17 @@
         <w:t xml:space="preserve"> </w:t>
       </w:r>
       <w:r>
-        <w:t xml:space="preserve">(</w:t>
-      </w:r>
-      <w:r>
-        <w:rPr>
-          <w:bCs/>
-          <w:b/>
-        </w:rPr>
-        <w:t xml:space="preserve">faulkner2011?</w:t>
+        <w:t xml:space="preserve">(Faulkner,</w:t>
+      </w:r>
+      <w:r>
+        <w:t xml:space="preserve"> </w:t>
+      </w:r>
+      <w:r>
+        <w:rPr>
+          <w:iCs/>
+          <w:i/>
+        </w:rPr>
+        <w:t xml:space="preserve">Absalom, Absalom!</w:t>
       </w:r>
       <w:r>
         <w:t xml:space="preserve">)</w:t>
@@ -5871,7 +6417,53 @@
       </w:r>
     </w:p>
   </w:footnote>
-  <w:footnote w:id="40">
+  <w:footnote w:id="39">
+    <w:p>
+      <w:pPr>
+        <w:pStyle w:val="FootnoteText"/>
+      </w:pPr>
+      <w:r>
+        <w:rPr>
+          <w:rStyle w:val="FootnoteReference"/>
+        </w:rPr>
+        <w:footnoteRef/>
+      </w:r>
+      <w:r>
+        <w:t xml:space="preserve"> </w:t>
+      </w:r>
+      <w:r>
+        <w:t xml:space="preserve">This number exceeds that of the</w:t>
+      </w:r>
+      <w:r>
+        <w:t xml:space="preserve"> </w:t>
+      </w:r>
+      <w:r>
+        <w:t xml:space="preserve">“</w:t>
+      </w:r>
+      <w:r>
+        <w:t xml:space="preserve">fallible</w:t>
+      </w:r>
+      <w:r>
+        <w:t xml:space="preserve">”</w:t>
+      </w:r>
+      <w:r>
+        <w:t xml:space="preserve"> </w:t>
+      </w:r>
+      <w:r>
+        <w:t xml:space="preserve">manual count done by Fred Randel quite a bit. He arrived at 594 pairs, but does not have the benefit computational exactitude</w:t>
+      </w:r>
+      <w:r>
+        <w:t xml:space="preserve"> </w:t>
+      </w:r>
+      <w:r>
+        <w:t xml:space="preserve">(Randel 471)</w:t>
+      </w:r>
+      <w:r>
+        <w:t xml:space="preserve">.</w:t>
+      </w:r>
+    </w:p>
+  </w:footnote>
+  <w:footnote w:id="41">
     <w:p>
       <w:pPr>
         <w:pStyle w:val="FootnoteText"/>
@@ -6053,7 +6645,7 @@
       </w:r>
     </w:p>
   </w:footnote>
-  <w:footnote w:id="41">
+  <w:footnote w:id="42">
     <w:p>
       <w:pPr>
         <w:pStyle w:val="FootnoteText"/>
@@ -6068,43 +6660,7 @@
         <w:t xml:space="preserve"> </w:t>
       </w:r>
       <w:r>
-        <w:t xml:space="preserve">It appears that ngrams also follow Zipf’s law. That is, the word frequency of words is proportional to their rank order. Thus, the second most frequent word will be half as frequent as the the first most frequent, the third most frequent will be one third as frequent and so forth. One effect that is hard to account for is that there might be common ngrams that tend to appear across a lot of English works that makes separating natural repetitions</w:t>
-      </w:r>
-      <w:r>
-        <w:t xml:space="preserve"> </w:t>
-      </w:r>
-      <w:r>
-        <w:t xml:space="preserve">“</w:t>
-      </w:r>
-      <w:r>
-        <w:t xml:space="preserve">he told her that</w:t>
-      </w:r>
-      <w:r>
-        <w:t xml:space="preserve">”</w:t>
-      </w:r>
-      <w:r>
-        <w:t xml:space="preserve"> </w:t>
-      </w:r>
-      <w:r>
-        <w:t xml:space="preserve">from authorially unique repetitions,</w:t>
-      </w:r>
-      <w:r>
-        <w:t xml:space="preserve"> </w:t>
-      </w:r>
-      <w:r>
-        <w:t xml:space="preserve">“</w:t>
-      </w:r>
-      <w:r>
-        <w:t xml:space="preserve">I hold no brief</w:t>
-      </w:r>
-      <w:r>
-        <w:t xml:space="preserve">”</w:t>
-      </w:r>
-      <w:r>
-        <w:t xml:space="preserve"> </w:t>
-      </w:r>
-      <w:r>
-        <w:t xml:space="preserve">quite difficult.</w:t>
+        <w:t xml:space="preserve">It appears that ngrams also follow Zipf’s law. That is, the word frequency of words is proportional to their rank order. Thus, the second most frequent word will be half as frequent as the the first most frequent, the third most frequent will be one third as frequent and so forth.</w:t>
       </w:r>
     </w:p>
   </w:footnote>

</xml_diff>

<commit_message>
first major draft complete
</commit_message>
<xml_diff>
--- a/absalom_four_dimensions.docx
+++ b/absalom_four_dimensions.docx
@@ -237,22 +237,22 @@
           <w:iCs/>
           <w:i/>
         </w:rPr>
-        <w:t xml:space="preserve">DY)</w:t>
-      </w:r>
-      <w:r>
-        <w:t xml:space="preserve">. Hosted by the University of Virginia,</w:t>
-      </w:r>
-      <w:r>
-        <w:t xml:space="preserve"> </w:t>
-      </w:r>
-      <w:r>
-        <w:rPr>
-          <w:iCs/>
-          <w:i/>
-        </w:rPr>
         <w:t xml:space="preserve">DY</w:t>
       </w:r>
       <w:r>
+        <w:t xml:space="preserve">). Hosted by the University of Virginia,</w:t>
+      </w:r>
+      <w:r>
+        <w:t xml:space="preserve"> </w:t>
+      </w:r>
+      <w:r>
+        <w:rPr>
+          <w:iCs/>
+          <w:i/>
+        </w:rPr>
+        <w:t xml:space="preserve">DY</w:t>
+      </w:r>
+      <w:r>
         <w:t xml:space="preserve"> </w:t>
       </w:r>
       <w:r>
@@ -338,7 +338,7 @@
         <w:t xml:space="preserve"> </w:t>
       </w:r>
       <w:r>
-        <w:t xml:space="preserve">the mysteries of the text – to make the formula react – such an approach glosses over the highly interpretive nature of textual encoding, and, more to the point, contradicts</w:t>
+        <w:t xml:space="preserve">the mysteries of the text, so to speak – to make the formula react – such an approach glosses over the highly interpretive nature of textual encoding, and, more to the point, contradicts</w:t>
       </w:r>
       <w:r>
         <w:t xml:space="preserve"> </w:t>
@@ -518,7 +518,7 @@
         <w:t xml:space="preserve"> </w:t>
       </w:r>
       <w:r>
-        <w:t xml:space="preserve">In keeping with the gender norms of the period, the women were certainly more confined to the domestic space. Though Judith occasionally travels to Memphis, she mostly travels the 12 mile journey to town</w:t>
+        <w:t xml:space="preserve">In keeping with the gender norms of the period, the women were certainly more confined to the domestic space. Though Judith occasionally visits Memphis, she mostly travels the twelve mile journey to town</w:t>
       </w:r>
       <w:r>
         <w:t xml:space="preserve"> </w:t>
@@ -536,7 +536,7 @@
         <w:t xml:space="preserve"> </w:t>
       </w:r>
       <w:r>
-        <w:t xml:space="preserve">during her youth (54). Nevertheless, over the course of the novel she appears in events with 48 different characters, 34 of whom are minor or peripheral. Clytemnestra – Sutpen’s daughter conceived through his sexual exploitation of an enslaved woman – is probably the most marginalized person in the text, but still she appears with 31 other characters, even if none of the cooccurrrences speak to any type of social life outside of serving the Sutpen family. The men on the Sutpen plantation have far more robust social connections, Thomas Sutpen meets 87 characters, while Henry is connected to different 61 characters. Though certainly an eccentric family, they are reluctantly ensnared into Jefferson’s social fabric. This relationship between the Sutpens and the wider world helps contextualize the pressure they would have faced to conform to community mores. Sutpen’s Hundred may have been vast, but it was not an island.</w:t>
+        <w:t xml:space="preserve">during her youth (54). Nevertheless, over the course of the novel she appears in events with 48 different characters, 34 of whom are minor or peripheral. Clytemnestra – Sutpen’s daughter conceived through his sexual exploitation of an enslaved woman – is probably the most marginalized person in the text, but still she appears with 31 other characters, even if none of the cooccurrrences speak to any type of social life outside of serving the Sutpen family. The men on the Sutpen plantation have far more robust social connections, Thomas and Henry Sutpen appear with 87 and 61 characters respectively. Though certainly an eccentric family, they are reluctantly ensnared into Jefferson’s social fabric. This relationship between the Sutpens and the wider world helps contextualize the pressure they would have faced to conform to community mores. Sutpen’s Hundred may have been vast, but it was not an island.</w:t>
       </w:r>
     </w:p>
     <w:p>
@@ -601,6 +601,33 @@
         <w:t xml:space="preserve">(Saks 71)</w:t>
       </w:r>
       <w:r>
+        <w:t xml:space="preserve">. In fact, the idea that someone could be both</w:t>
+      </w:r>
+      <w:r>
+        <w:t xml:space="preserve"> </w:t>
+      </w:r>
+      <w:r>
+        <w:t xml:space="preserve">“</w:t>
+      </w:r>
+      <w:r>
+        <w:t xml:space="preserve">black and brother</w:t>
+      </w:r>
+      <w:r>
+        <w:t xml:space="preserve">”</w:t>
+      </w:r>
+      <w:r>
+        <w:t xml:space="preserve"> </w:t>
+      </w:r>
+      <w:r>
+        <w:t xml:space="preserve">was a nightmare scenario for racist White southerners</w:t>
+      </w:r>
+      <w:r>
+        <w:t xml:space="preserve"> </w:t>
+      </w:r>
+      <w:r>
+        <w:t xml:space="preserve">(Ladd 546)</w:t>
+      </w:r>
+      <w:r>
         <w:t xml:space="preserve">. The fear of White and Black</w:t>
       </w:r>
       <w:r>
@@ -666,7 +693,16 @@
         <w:pStyle w:val="BodyText"/>
       </w:pPr>
       <w:r>
-        <w:t xml:space="preserve">These stark divisions of race are reflected in important but slightly different ways in the basic demographics of the real Lafayette County and Faulkner’s fictional Yoknapatawpha. In his thorough historical account of northern Mississippi, Don Harrison Doyle shows that the ratio of Black (40%) and White (60%) identified people in the county was relatively stable throughout the county’s history. There is no room for people who do not fit either category neatly.</w:t>
+        <w:t xml:space="preserve">These stark divisions of race are reflected in important but slightly different ways in the basic demographics of the real Lafayette County and Faulkner’s fictional Yoknapatawpha. In his thorough historical account of northern Mississippi, Don Harrison Doyle shows that the ratio of Black (40%) and White (60%) identified people in the county was relatively stable throughout the county’s history</w:t>
+      </w:r>
+      <w:r>
+        <w:t xml:space="preserve"> </w:t>
+      </w:r>
+      <w:r>
+        <w:t xml:space="preserve">(Doyle 303)</w:t>
+      </w:r>
+      <w:r>
+        <w:t xml:space="preserve">. There is no room for people who do not fit either category neatly.</w:t>
       </w:r>
     </w:p>
     <w:p>
@@ -743,7 +779,7 @@
         <w:t xml:space="preserve"> </w:t>
       </w:r>
       <w:r>
-        <w:t xml:space="preserve">a particular character might get in a movie. The distinction is important. For example, the extraterrestrial being in the movie is</w:t>
+        <w:t xml:space="preserve">a particular character might get in a movie. The distinction is significant. For example, the extraterrestrial being in the movie is</w:t>
       </w:r>
       <w:r>
         <w:t xml:space="preserve"> </w:t>
@@ -864,7 +900,7 @@
         <w:t xml:space="preserve"> </w:t>
       </w:r>
       <w:r>
-        <w:t xml:space="preserve">wife and a child, but also learns that Bon may be his half-brother. Henry is willing to look past bigamy and incest. In the end,</w:t>
+        <w:t xml:space="preserve">wife and a child, but also discovers that Bon may be his half-brother. Henry is willing to look past bigamy and incest. In the end,</w:t>
       </w:r>
       <w:r>
         <w:t xml:space="preserve"> </w:t>
@@ -1805,7 +1841,7 @@
         <w:t xml:space="preserve"> </w:t>
       </w:r>
       <w:r>
-        <w:t xml:space="preserve">1550 mi.). A compass placed on a map with Northern Mississippi as its anchor and traced across the locations in order would create a spiral. The Sutpen family history is ostensibly a local curiosity, but in its retelling it draws in an ever expanding vortex of more distant places. Stretching the spiral metaphor ever so slightly, it could equally well include Harvard (</w:t>
+        <w:t xml:space="preserve">1550 mi.). A compass placed on a map with Northern Mississippi as its anchor, and traced across the locations in order would create a spiral. The Sutpen family history is ostensibly a local curiosity, but in its retelling it draws in an ever expanding vortex of more distant places. Stretching the spiral metaphor ever so slightly, it could equally well include Harvard (</w:t>
       </w:r>
       <m:oMath>
         <m:r>
@@ -2006,7 +2042,7 @@
         <w:pStyle w:val="BodyText"/>
       </w:pPr>
       <w:r>
-        <w:t xml:space="preserve">Reading the map from left to right, several important features are visible. Immediately noticeable is the large circle at the Sutpen Plantation. It is preeminent among all the other locations. In fact, many of the smaller circles surrounding Sutpen’s Hundred are places on the vast property. Within the county most of the locations are confined to the areas between the plantation and the town, with a smattering of events in the direct north of the county when Sutpen is searching for the French Architect. The relative sparsity of locations in the county suggest the intense focus on the Sutpen plantation early on in the text. Taking a broader view, it is clear that the action travels to quite a number of places outside of Yoknapatawpha, notably New Orleans, Tidewater, the South during the Civil War, and Haiti. Sutpen is ubiquitous across these locations and there are few places where he is not the most present character in an event, or indeed, the only present character in an event. The key exceptions to this are the three narrative positions: The Coldfield House, the Compson Place, and Harvard. Spatially, these locations move the story farther away from the Sutpen Place. The Coldfield place represents a bridge Sutpen’s life and its retelling. It is the only place Sutpen visits that is also the location of a living narrator.</w:t>
+        <w:t xml:space="preserve">Reading the map from left to right, several important features are visible. Immediately noticeable is the large circle at the Sutpen Plantation. It is preeminent among all the other locations. In fact, many of the smaller circles surrounding Sutpen’s Hundred are places on the vast property. Within the county, most of the locations are confined to the areas between the plantation and the town, with a smattering of events in the direct north of the county when Sutpen is searching for the French Architect. The relative sparsity of locations in the county suggest the intense focus on the Sutpen plantation early on in the text. Taking a broader view, it is clear that the action travels to quite a number of places outside of Yoknapatawpha, notably New Orleans, Tidewater, the South during the Civil War, and Haiti. Sutpen is ubiquitous across these locations and there are few places where he is not the most present character in an event, or indeed, the only present character in an event. The key exceptions to this are the three narrative positions: The Coldfield House, the Compson Place, and Harvard. Spatially, these locations move the story farther away from the Sutpen Place. The Coldfield place represents a bridge between Sutpen’s life and its retelling. It is the only place Sutpen visits that is also the location of a living narrator.</w:t>
       </w:r>
     </w:p>
     <w:p>
@@ -2122,7 +2158,7 @@
         <w:t xml:space="preserve"> </w:t>
       </w:r>
       <w:r>
-        <w:t xml:space="preserve">enslaved peoples (48). To the people of the town, Haiti is an economic and cultural entrepôt between the New World and the Old, or as Quentin’s grandfather describes it,</w:t>
+        <w:t xml:space="preserve">enslaved peoples (48). To the people of the town and probably the South more generally, Haiti is an economic and cultural entrepôt between the New World and the Old, or as Quentin’s grandfather describes it,</w:t>
       </w:r>
       <w:r>
         <w:t xml:space="preserve"> </w:t>
@@ -2184,16 +2220,16 @@
         <w:pStyle w:val="BodyText"/>
       </w:pPr>
       <w:r>
-        <w:t xml:space="preserve">The displacement of slavery onto Haiti is striking. Haiti became the first Black republic in the Western Hemisphere in 1804, and thus abolished slavery several years before Sutpen was even born. This historical discrepancy has spawned a substantial critical debate (See for example:</w:t>
-      </w:r>
-      <w:r>
-        <w:t xml:space="preserve"> </w:t>
-      </w:r>
-      <w:r>
-        <w:t xml:space="preserve">(Godden; Matthews; Stanchich)</w:t>
-      </w:r>
-      <w:r>
-        <w:t xml:space="preserve">). Most recently, Wanda Raiford has made the provocative argument that the elision of the historical Haiti and its unqualified acceptance by every listener in the text, also implicates the reader in the erasure of US imperial history and Black agency</w:t>
+        <w:t xml:space="preserve">The displacement of slavery onto Haiti is striking. Haiti became the first Black republic in the Western Hemisphere in 1804, and thus abolished slavery several years before Sutpen was even born. This historical discrepancy has spawned a substantial critical debate</w:t>
+      </w:r>
+      <w:r>
+        <w:t xml:space="preserve"> </w:t>
+      </w:r>
+      <w:r>
+        <w:t xml:space="preserve">(See for example: Godden; Matthews; Stanchich)</w:t>
+      </w:r>
+      <w:r>
+        <w:t xml:space="preserve">. Most recently, Wanda Raiford has made the provocative argument that the elision of the historical Haiti and its unqualified acceptance by every listener in the text, also implicates the reader in the erasure of US imperial history and Black agency</w:t>
       </w:r>
       <w:r>
         <w:t xml:space="preserve"> </w:t>
@@ -2264,7 +2300,7 @@
         <w:pStyle w:val="BodyText"/>
       </w:pPr>
       <w:r>
-        <w:t xml:space="preserve">As the constellation of locations suggests, the plantation system does not stop neatly at the Mason-Dixon line, no matter how much both Quentin and Shreve try to contain it in the South. Despite its role in the abolitionist movement, Harvard, directly and indirectly profited from slavery</w:t>
+        <w:t xml:space="preserve">As the constellation of locations suggests, the plantation system does not stop neatly at the Mason-Dixon line. Despite its role in the abolitionist movement, Harvard, directly and indirectly profited from slavery</w:t>
       </w:r>
       <w:r>
         <w:t xml:space="preserve"> </w:t>
@@ -2273,7 +2309,7 @@
         <w:t xml:space="preserve">(Beckert et al. 226?)</w:t>
       </w:r>
       <w:r>
-        <w:t xml:space="preserve">. Historically, Quentin is following in the footsteps of other sons of slave owners and, later, former slave owners who went to Harvard and other elite Northern institutions to be conferred a degree and respectability</w:t>
+        <w:t xml:space="preserve">. Moreover, Quentin is following in the footsteps of other sons of slave owners and, later, former slave owners who went to Harvard and other elite Northern institutions to be conferred a degree and respectability</w:t>
       </w:r>
       <w:r>
         <w:t xml:space="preserve"> </w:t>
@@ -2319,7 +2355,7 @@
         <w:pStyle w:val="BodyText"/>
       </w:pPr>
       <w:r>
-        <w:t xml:space="preserve">The only one who appears fully disconnected from the system of human bondage that shaped the transatlantic world is Shreve. As a Canadian outsider and someone unfamiliar with the South, this is ostensibly all alien to him. Yet, he and Quentin are still connected by the same River, the</w:t>
+        <w:t xml:space="preserve">Only Shreve appears disconnected from the system of human bondage that shaped the transatlantic world. As a Canadian outsider and someone unfamiliar with the South, this is ostensibly all alien to him. Yet, he and Quentin are still connected by the same River, the</w:t>
       </w:r>
       <w:r>
         <w:t xml:space="preserve"> </w:t>
@@ -2355,7 +2391,7 @@
         <w:t xml:space="preserve"> </w:t>
       </w:r>
       <w:r>
-        <w:t xml:space="preserve">that runs from Mississippi to Edmonton (208). The waterways that bring together the two Harvard classmen were also used to ferry enslaved people, their commodities, and ideas that supported these social relations north and south. Through these arteries it appears that Shreve has inherited the plantation system’s perverse racial logic. While Quentin is famously ambivalent about his relationship with the South and its troubled past, Shreve’s vision of the region and the future it portends is one of white racial suicide. He prophesies that</w:t>
+        <w:t xml:space="preserve">that runs from Mississippi to Edmonton (208). The waterways that bring together the two Harvard classmen were also used to ferry enslaved people, the commodities they produced, and the ideas that perpetuated these social relations between north and south. Shreve has inherited the plantation system’s perverse racial logic through these various arteries. While Quentin is famously ambivalent about his relationship with the South and its troubled past, Shreve’s vision of the region and the future it portends is one of white racial suicide. He prophesies that</w:t>
       </w:r>
       <w:r>
         <w:t xml:space="preserve"> </w:t>
@@ -2445,7 +2481,7 @@
         <w:t xml:space="preserve"> </w:t>
       </w:r>
       <w:r>
-        <w:t xml:space="preserve">suggesting that Black heritage represents an inferiority beyond skin color. Shreve’s own obsessions with race show that the legacy of enslavement cannot be told through one individual family, region, or, even country, but is, in fact, the origin story of the western world.</w:t>
+        <w:t xml:space="preserve">suggesting that Black heritage represents an inferiority beyond skin color (303). Shreve’s own obsessions with race show that the legacy of enslavement cannot be told through one individual family, region, or, even country, but is, in fact, the origin story of the western world.</w:t>
       </w:r>
     </w:p>
     <w:bookmarkEnd w:id="31"/>
@@ -2623,13 +2659,10 @@
         <w:t xml:space="preserve"> </w:t>
       </w:r>
       <w:r>
-        <w:t xml:space="preserve">(Egan 201–02; Brooks; Matlack)</w:t>
-      </w:r>
-      <w:r>
-        <w:t xml:space="preserve"> </w:t>
-      </w:r>
-      <w:r>
-        <w:t xml:space="preserve">(EGAN 201-202, BROOKS, MATLACK ), but it was not until the assiduous work of Steve Railton in 2003 that it became possible to visualize its chronology on a digital timeline.</w:t>
+        <w:t xml:space="preserve">(Egan 201–02; C. Brooks; Matlack)</w:t>
+      </w:r>
+      <w:r>
+        <w:t xml:space="preserve">, but it was not until the assiduous work of Steve Railton in 2003 that it became possible to visualize its chronology on a digital timeline.</w:t>
       </w:r>
       <w:r>
         <w:rPr>
@@ -2817,7 +2850,13 @@
         <w:t xml:space="preserve">(Burgers)</w:t>
       </w:r>
       <w:r>
-        <w:t xml:space="preserve">. The chart below has been reproduced in greyscale for this essay. It shows the narrative structure of the text, and how that information is conveyed to the reader: narrated through the external narrator, told by one of the characters, or conveyed through one of the other types of narration identified by</w:t>
+        <w:t xml:space="preserve">.</w:t>
+      </w:r>
+      <w:r>
+        <w:br/>
+      </w:r>
+      <w:r>
+        <w:t xml:space="preserve">The chart below has been reproduced in greyscale for this essay. It shows the narrative structure of the text, and how that information is conveyed to the reader: narrated through the external narrator, told by one of the characters, or conveyed through one of the other types of narration identified by</w:t>
       </w:r>
       <w:r>
         <w:t xml:space="preserve"> </w:t>
@@ -2838,14 +2877,14 @@
     </w:p>
     <w:p>
       <w:pPr>
-        <w:pStyle w:val="BodyText"/>
+        <w:pStyle w:val="CaptionedFigure"/>
       </w:pPr>
       <w:r>
         <w:drawing>
           <wp:inline>
             <wp:extent cx="4902332" cy="1914973"/>
             <wp:effectExtent b="0" l="0" r="0" t="0"/>
-            <wp:docPr descr="" title="" id="1" name="Picture"/>
+            <wp:docPr descr="Figure 3: Plot Structure of Absalom, Absalom!. Particularly notable, is the repetition of an S pattern throughout. This indicates a similar structure across the chapters." title="" id="1" name="Picture"/>
             <a:graphic>
               <a:graphicData uri="http://schemas.openxmlformats.org/drawingml/2006/picture">
                 <pic:pic>
@@ -2885,10 +2924,27 @@
     </w:p>
     <w:p>
       <w:pPr>
+        <w:pStyle w:val="ImageCaption"/>
+      </w:pPr>
+      <w:r>
+        <w:t xml:space="preserve">Figure 3: Plot Structure of</w:t>
+      </w:r>
+      <w:r>
+        <w:t xml:space="preserve"> </w:t>
+      </w:r>
+      <w:r>
+        <w:t xml:space="preserve">Absalom, Absalom!</w:t>
+      </w:r>
+      <w:r>
+        <w:t xml:space="preserve">. Particularly notable, is the repetition of an S pattern throughout. This indicates a similar structure across the chapters.</w:t>
+      </w:r>
+    </w:p>
+    <w:p>
+      <w:pPr>
         <w:pStyle w:val="BodyText"/>
       </w:pPr>
       <w:r>
-        <w:t xml:space="preserve">At first blush, the above chart can be a bit overwhelming; it is condensing a lot of data into a very small space. It is easiest to break it down into several components. First, the top line of squares that gradually rises from left to right represents the narrative present. These are all the conversations Quentin has with Rosa, his father, and Shreve during the summer of 1909 and winter of 1910. The major stretches of the story told by one narrator are also marked on this top line: Rosa, Mr. Compson, Quentin, Shreve, and, finally, Shreve and Quentin together. Below this top line are all the events that happened in the past. The gray dots that appear to</w:t>
+        <w:t xml:space="preserve">At first blush, the above chart can be a bit overwhelming, and it is easiest to break it down into several components. First, the top line of squares that gradually rises from left to right represents the narrative present. These are all the conversations Quentin has with Rosa, his father, and Shreve during the summer of 1909 and winter of 1910. The major stretches of the story told by one narrator are also marked on this top line: Rosa, Mr. Compson, Quentin, Shreve, and, finally, Shreve and Quentin together. Below this top line are all the events that happened in the past. The gray dots that appear to</w:t>
       </w:r>
       <w:r>
         <w:t xml:space="preserve"> </w:t>
@@ -2924,7 +2980,7 @@
         <w:t xml:space="preserve"> </w:t>
       </w:r>
       <w:r>
-        <w:t xml:space="preserve">curves. The shape of the curve gives an indication about the narrative pacing. Each narrator opens their story with a lot of detail and a high density of events near the end, but there is a tendency to skip through the middle with larger chronological jumps. All the while, the various s-curves make their way towards the present. Some curves start farther down and others end higher up. This difference in clustering makes more sense relative to the line markers, which indicate chapters. Moving from left to right there is a small S at the bottom of chapter 1, a second one that stretches from chapter 2-3, the most substantial one that goes all the way from chapter 4 to chapter 7 and then finally two individual curves in chapter 7 and 8. These patterns suggest the way in which chapters 1 and 2 act as a preview to the story, while chapter 4-7 develop the rising action. Meanwhile, chapters 7 and 8 each in their own way represent a climax, as information that was hinted at previously is explained more fully, if still incompletely. Within chapters there is a consistent pattern as well. They open in the present, drop down into the</w:t>
+        <w:t xml:space="preserve">curves. The shape of the curve gives an indication about the narrative pacing. Each narrator opens their story with a lot of detail and a high density of events near the end, but there is a tendency to skip through the middle with larger chronological jumps. All the while, the various s-curves make their way towards the present. Some curves start farther down and others end higher up. This difference in clustering makes more sense relative to the line markers, which indicate chapters. Moving from left to right there is a small S at the bottom of chapter 1, a second one that stretches from chapter 2 to 3, the most substantial one that goes all the way from chapter 4 to chapter 7, and then finally two individual curves in chapter 7 and 8. These patterns suggest the way in which chapters 1 and 2 act as a preview to the story, while chapter 4-7 develop the rising action. Meanwhile, chapters 7 and 8 each in their own way represent a climax, as information that was hinted at previously is explained more fully, if still incompletely. Within chapters there is a consistent pattern as well. They open in the present, drop down into the</w:t>
       </w:r>
       <w:r>
         <w:t xml:space="preserve"> </w:t>
@@ -2942,7 +2998,7 @@
         <w:t xml:space="preserve"> </w:t>
       </w:r>
       <w:r>
-        <w:t xml:space="preserve">past and work their way back up towards the present. There might be some errant events that float between the S curve and the narrative present, but generally these are previews for events that will happen later. The pattern is actually pretty regular overall. In this sense, all the chapters work together to tell the</w:t>
+        <w:t xml:space="preserve">past, and work their way back up towards the present. There might be some errant events that float between the S curve and the narrative present, but generally these are previews for events that will happen later. The pattern is actually pretty regular overall. In this sense, all the chapters work together to tell the</w:t>
       </w:r>
       <w:r>
         <w:t xml:space="preserve"> </w:t>
@@ -2960,7 +3016,7 @@
         <w:t xml:space="preserve"> </w:t>
       </w:r>
       <w:r>
-        <w:t xml:space="preserve">story of Sutpen. With a little imagination, one could even slide the curves into each other to make one long curve of the events and put them all in the right order. To help understand what is going on at each point on the chart, certain major events have been annotated. On occasion, some, though certainly not all, repetitions of major events are marked. This is particularly true of Henry shooting Bon, which is an event that is alluded to at least four times.</w:t>
+        <w:t xml:space="preserve">story of Sutpen. With a little imagination, one could even slide the curves into each other to make one long curve of the events and put them all in the right order. To help understand what is going on at each point on the chart, certain major events have been annotated. On occasion, some, though certainly not all, repetitions of major events are marked. This is particularly true of Henry shooting Bon, which is alluded to at least four times.</w:t>
       </w:r>
     </w:p>
     <w:p>
@@ -3060,7 +3116,24 @@
         <w:t xml:space="preserve"> </w:t>
       </w:r>
       <w:r>
-        <w:t xml:space="preserve">is certainly a story, it is as much about the telling as it is about the tale. If Faulkner’s prose can seem impenetrable, it is because he plays with language so much that it draws attention to itself. Indeed, a number of critics have taken this approach and pointed out that Faulkner’s use of language in</w:t>
+        <w:t xml:space="preserve">is certainly a story, it is as much about the telling as it is about the tale. If Faulkner’s prose can seem impenetrable, it is because it is. Yet, the impenetrability helps the language call attention to itself. To be sure, scholars have pointed out this effect throughout the long genealogy of Faulkner criticism, even if the theoretical idioms in which they do so offer different nuances</w:t>
+      </w:r>
+      <w:r>
+        <w:t xml:space="preserve"> </w:t>
+      </w:r>
+      <w:r>
+        <w:t xml:space="preserve">(Zoellner 500; Hodgson 103–04; P. Brooks 263)</w:t>
+      </w:r>
+      <w:r>
+        <w:t xml:space="preserve">. Computational analysis amplifies these interpretations by visualizing how Faulkner’s language resists the possiblity of telling a story fully.</w:t>
+      </w:r>
+    </w:p>
+    <w:p>
+      <w:pPr>
+        <w:pStyle w:val="BodyText"/>
+      </w:pPr>
+      <w:r>
+        <w:t xml:space="preserve">The most infamous stylistic feature of</w:t>
       </w:r>
       <w:r>
         <w:t xml:space="preserve"> </w:t>
@@ -3076,20 +3149,116 @@
         <w:t xml:space="preserve"> </w:t>
       </w:r>
       <w:r>
-        <w:t xml:space="preserve">is TODO Fill in</w:t>
-      </w:r>
-      <w:r>
-        <w:t xml:space="preserve"> </w:t>
-      </w:r>
-      <w:r>
-        <w:rPr>
-          <w:bCs/>
-          <w:b/>
-        </w:rPr>
-        <w:t xml:space="preserve">blank, blank, blank</w:t>
-      </w:r>
-      <w:r>
-        <w:t xml:space="preserve">. Pushing these insights further, computational analysis suggests that the Faulkner’s language resists the notion that a story can ever be fully told.</w:t>
+        <w:t xml:space="preserve">is certainly the length of the sentences. In fact, according to the 1983</w:t>
+      </w:r>
+      <w:r>
+        <w:t xml:space="preserve"> </w:t>
+      </w:r>
+      <w:r>
+        <w:rPr>
+          <w:iCs/>
+          <w:i/>
+        </w:rPr>
+        <w:t xml:space="preserve">Guinness Book of World Records</w:t>
+      </w:r>
+      <w:r>
+        <w:t xml:space="preserve"> </w:t>
+      </w:r>
+      <w:r>
+        <w:t xml:space="preserve">it holds the dubious record of the longest sentence in the English language – 1,300 words</w:t>
+      </w:r>
+      <w:r>
+        <w:t xml:space="preserve"> </w:t>
+      </w:r>
+      <w:r>
+        <w:t xml:space="preserve">(McWhirter 228)</w:t>
+      </w:r>
+      <w:r>
+        <w:t xml:space="preserve">. The claim is both absurd because it is an achievement that could easily be bested</w:t>
+      </w:r>
+      <w:r>
+        <w:t xml:space="preserve"> </w:t>
+      </w:r>
+      <w:r>
+        <w:t xml:space="preserve">(Pinker 83)</w:t>
+      </w:r>
+      <w:r>
+        <w:t xml:space="preserve">, and inaccurate because James Joyce’s</w:t>
+      </w:r>
+      <w:r>
+        <w:t xml:space="preserve"> </w:t>
+      </w:r>
+      <w:r>
+        <w:rPr>
+          <w:iCs/>
+          <w:i/>
+        </w:rPr>
+        <w:t xml:space="preserve">Ulysses</w:t>
+      </w:r>
+      <w:r>
+        <w:t xml:space="preserve"> </w:t>
+      </w:r>
+      <w:r>
+        <w:t xml:space="preserve">certainly has longer sentences, while Faulkner himself beat his own</w:t>
+      </w:r>
+      <w:r>
+        <w:t xml:space="preserve"> </w:t>
+      </w:r>
+      <w:r>
+        <w:t xml:space="preserve">“</w:t>
+      </w:r>
+      <w:r>
+        <w:t xml:space="preserve">record</w:t>
+      </w:r>
+      <w:r>
+        <w:t xml:space="preserve">”</w:t>
+      </w:r>
+      <w:r>
+        <w:t xml:space="preserve"> </w:t>
+      </w:r>
+      <w:r>
+        <w:t xml:space="preserve">with a 1,600 word sentence in</w:t>
+      </w:r>
+      <w:r>
+        <w:t xml:space="preserve"> </w:t>
+      </w:r>
+      <w:r>
+        <w:rPr>
+          <w:iCs/>
+          <w:i/>
+        </w:rPr>
+        <w:t xml:space="preserve">Go Down, Moses</w:t>
+      </w:r>
+      <w:r>
+        <w:t xml:space="preserve"> </w:t>
+      </w:r>
+      <w:r>
+        <w:t xml:space="preserve">(Fargnoli and Golay 102)</w:t>
+      </w:r>
+      <w:r>
+        <w:t xml:space="preserve">. Faulkner’s long sentences are more than a matter of trivia, however; they quite literally stretch the very concept of the sentence, and by extension the English language. It is a measure of some comfort that they cause trouble for computers and humans alike. Normally, computing sentence length in a text is a very simple procedure. With</w:t>
+      </w:r>
+      <w:r>
+        <w:t xml:space="preserve"> </w:t>
+      </w:r>
+      <w:r>
+        <w:rPr>
+          <w:iCs/>
+          <w:i/>
+        </w:rPr>
+        <w:t xml:space="preserve">Absalom, Absalom!</w:t>
+      </w:r>
+      <w:r>
+        <w:t xml:space="preserve">, there are so many parenthetical phrases and embedded quotations that it is difficult to detect whether a sentence has ended. This is to say nothing of the far more profound intellectual questions these long pieces of text provoke about the grammatical structure of sentences. There are no hard and fast rules as to how long a sentence can be, and yet at a certain point the structure becomes so complex that it might well be syntactically correct but is semantically incoherent. Perhaps it is better to say, therefore, that the novel is a collection of clauses occasionally interrupted by punctuation. Given this, the computed average sentence length of 50 words per sentence is at best a rough measure. What is clear though, is that this is significantly longer than other works in English written in the 1930s, which use only about 13 words per sentence</w:t>
+      </w:r>
+      <w:r>
+        <w:t xml:space="preserve"> </w:t>
+      </w:r>
+      <w:r>
+        <w:t xml:space="preserve">(Rudnicka 233)</w:t>
+      </w:r>
+      <w:r>
+        <w:t xml:space="preserve">. The average masks the sheer number of long sentences: 373 sentences exceed 100 words.</w:t>
       </w:r>
     </w:p>
     <w:p>
@@ -3097,7 +3266,84 @@
         <w:pStyle w:val="BodyText"/>
       </w:pPr>
       <w:r>
-        <w:t xml:space="preserve">The most infamous stylistic feature of</w:t>
+        <w:t xml:space="preserve">For Faulkner, these long sentence are more than rhetorical pyrotechnics, they try to capture how the past continuously intrudes upon the present. Asked in an interview about why he wrote such long sentences, Faulkner contends that there is no such thing as</w:t>
+      </w:r>
+      <w:r>
+        <w:t xml:space="preserve"> </w:t>
+      </w:r>
+      <w:r>
+        <w:t xml:space="preserve">“</w:t>
+      </w:r>
+      <w:r>
+        <w:t xml:space="preserve">was</w:t>
+      </w:r>
+      <w:r>
+        <w:t xml:space="preserve">”</w:t>
+      </w:r>
+      <w:r>
+        <w:t xml:space="preserve"> </w:t>
+      </w:r>
+      <w:r>
+        <w:t xml:space="preserve">because everyone brings their past with them. His long sentences are a way to capture this sensation,</w:t>
+      </w:r>
+      <w:r>
+        <w:t xml:space="preserve"> </w:t>
+      </w:r>
+      <w:r>
+        <w:t xml:space="preserve">“</w:t>
+      </w:r>
+      <w:r>
+        <w:t xml:space="preserve">a man, a character in a story at any moment of action is not just himself as he is then, he is all that made him, and the long sentence is an attempt to get his past and possibly his future into the instant in which he does something</w:t>
+      </w:r>
+      <w:r>
+        <w:t xml:space="preserve">”</w:t>
+      </w:r>
+      <w:r>
+        <w:t xml:space="preserve"> </w:t>
+      </w:r>
+      <w:r>
+        <w:t xml:space="preserve">(Faulkner,</w:t>
+      </w:r>
+      <w:r>
+        <w:t xml:space="preserve"> </w:t>
+      </w:r>
+      <w:r>
+        <w:rPr>
+          <w:iCs/>
+          <w:i/>
+        </w:rPr>
+        <w:t xml:space="preserve">Faulkner in the</w:t>
+      </w:r>
+      <w:r>
+        <w:rPr>
+          <w:iCs/>
+          <w:i/>
+        </w:rPr>
+        <w:t xml:space="preserve"> </w:t>
+      </w:r>
+      <w:r>
+        <w:rPr>
+          <w:iCs/>
+          <w:i/>
+        </w:rPr>
+        <w:t xml:space="preserve">University</w:t>
+      </w:r>
+      <w:r>
+        <w:t xml:space="preserve"> </w:t>
+      </w:r>
+      <w:r>
+        <w:t xml:space="preserve">84)</w:t>
+      </w:r>
+      <w:r>
+        <w:t xml:space="preserve">. In a sense, the prose complements the narrative structure, which also sees the past continuously returning.</w:t>
+      </w:r>
+    </w:p>
+    <w:p>
+      <w:pPr>
+        <w:pStyle w:val="BodyText"/>
+      </w:pPr>
+      <w:r>
+        <w:t xml:space="preserve">It is rare that the typography of a text is remarkable, but here too</w:t>
       </w:r>
       <w:r>
         <w:t xml:space="preserve"> </w:t>
@@ -3113,216 +3359,6 @@
         <w:t xml:space="preserve"> </w:t>
       </w:r>
       <w:r>
-        <w:t xml:space="preserve">is certainly the length of the sentences. In fact, according to the 1983</w:t>
-      </w:r>
-      <w:r>
-        <w:t xml:space="preserve"> </w:t>
-      </w:r>
-      <w:r>
-        <w:rPr>
-          <w:iCs/>
-          <w:i/>
-        </w:rPr>
-        <w:t xml:space="preserve">Guinness Book of World Records</w:t>
-      </w:r>
-      <w:r>
-        <w:t xml:space="preserve"> </w:t>
-      </w:r>
-      <w:r>
-        <w:t xml:space="preserve">it holds the dubious record of the longest sentence in the English language - 1,300 words</w:t>
-      </w:r>
-      <w:r>
-        <w:t xml:space="preserve"> </w:t>
-      </w:r>
-      <w:r>
-        <w:t xml:space="preserve">(McWhirter 228)</w:t>
-      </w:r>
-      <w:r>
-        <w:t xml:space="preserve">. The claim is both absurd because it is an achievement that could easily be bested</w:t>
-      </w:r>
-      <w:r>
-        <w:t xml:space="preserve"> </w:t>
-      </w:r>
-      <w:r>
-        <w:t xml:space="preserve">(Pinker 83)</w:t>
-      </w:r>
-      <w:r>
-        <w:t xml:space="preserve">, and inaccurate because James Joyce’s</w:t>
-      </w:r>
-      <w:r>
-        <w:t xml:space="preserve"> </w:t>
-      </w:r>
-      <w:r>
-        <w:rPr>
-          <w:iCs/>
-          <w:i/>
-        </w:rPr>
-        <w:t xml:space="preserve">Ulysses</w:t>
-      </w:r>
-      <w:r>
-        <w:t xml:space="preserve"> </w:t>
-      </w:r>
-      <w:r>
-        <w:t xml:space="preserve">certainly has longer sentences, while Faulkner himself beat his own</w:t>
-      </w:r>
-      <w:r>
-        <w:t xml:space="preserve"> </w:t>
-      </w:r>
-      <w:r>
-        <w:t xml:space="preserve">“</w:t>
-      </w:r>
-      <w:r>
-        <w:t xml:space="preserve">record</w:t>
-      </w:r>
-      <w:r>
-        <w:t xml:space="preserve">”</w:t>
-      </w:r>
-      <w:r>
-        <w:t xml:space="preserve"> </w:t>
-      </w:r>
-      <w:r>
-        <w:t xml:space="preserve">with a 1,600 word sentence in</w:t>
-      </w:r>
-      <w:r>
-        <w:t xml:space="preserve"> </w:t>
-      </w:r>
-      <w:r>
-        <w:rPr>
-          <w:iCs/>
-          <w:i/>
-        </w:rPr>
-        <w:t xml:space="preserve">Go Down, Moses</w:t>
-      </w:r>
-      <w:r>
-        <w:t xml:space="preserve"> </w:t>
-      </w:r>
-      <w:r>
-        <w:t xml:space="preserve">(Fargnoli and Golay 102)</w:t>
-      </w:r>
-      <w:r>
-        <w:t xml:space="preserve">. Faulkner’s long sentences are more than a matter of trivia, however; they quite literally stretch the very concept of the sentence, and by extension the English language. It is a measure of some comfort that they cause trouble for computers and humans alike. Normally, computing sentence length in a text is a very simple procedure. With</w:t>
-      </w:r>
-      <w:r>
-        <w:t xml:space="preserve"> </w:t>
-      </w:r>
-      <w:r>
-        <w:rPr>
-          <w:iCs/>
-          <w:i/>
-        </w:rPr>
-        <w:t xml:space="preserve">Absalom, Absalom!</w:t>
-      </w:r>
-      <w:r>
-        <w:t xml:space="preserve">, there are so many parenthetical phrases and embedded quotations that it is difficult to detect whether a sentence has ended. This is to say nothing of the far more profound intellectual questions these long pieces of text provoke about the grammatical structure of sentences. There is no hard and fast rules as to how long a sentence can be, and yet at a certain point the structure becomes so complex that all the connections might be syntactically correct but semantically incoherent. Perhaps it is better to say, therefore, that the novel is a collection of clauses occasionally interrupted by punctuation. Given this, the computed average sentence length of 50 words per sentence is at best a rough measure. What is clear though, is that this is significantly longer than other works in English written in the 1930s, which use only about 13 words per sentence</w:t>
-      </w:r>
-      <w:r>
-        <w:t xml:space="preserve"> </w:t>
-      </w:r>
-      <w:r>
-        <w:t xml:space="preserve">(Rudnicka 233)</w:t>
-      </w:r>
-      <w:r>
-        <w:t xml:space="preserve">. The average masks the sheer number of long sentences: 373 sentences exceed 100 words.</w:t>
-      </w:r>
-    </w:p>
-    <w:p>
-      <w:pPr>
-        <w:pStyle w:val="BodyText"/>
-      </w:pPr>
-      <w:r>
-        <w:t xml:space="preserve">For Faulkner, these long sentence are more than rhetorical pyrotechnics, they try to capture how the past continuously intrudes upon the present. Asked in an interview about why he wrote such long sentences, Faulkner contends that there is no such thing as</w:t>
-      </w:r>
-      <w:r>
-        <w:t xml:space="preserve"> </w:t>
-      </w:r>
-      <w:r>
-        <w:t xml:space="preserve">“</w:t>
-      </w:r>
-      <w:r>
-        <w:t xml:space="preserve">was</w:t>
-      </w:r>
-      <w:r>
-        <w:t xml:space="preserve">”</w:t>
-      </w:r>
-      <w:r>
-        <w:t xml:space="preserve"> </w:t>
-      </w:r>
-      <w:r>
-        <w:t xml:space="preserve">because everyone brings their past with them. His long sentences are a way to capture this sensation,</w:t>
-      </w:r>
-      <w:r>
-        <w:t xml:space="preserve"> </w:t>
-      </w:r>
-      <w:r>
-        <w:t xml:space="preserve">“</w:t>
-      </w:r>
-      <w:r>
-        <w:t xml:space="preserve">a man, a character in a story at any moment of action is not just himself as he is then, he is all that made him, and the long sentence is an attempt to get his past and possibly his future into the instant in which he does something</w:t>
-      </w:r>
-      <w:r>
-        <w:t xml:space="preserve">”</w:t>
-      </w:r>
-      <w:r>
-        <w:t xml:space="preserve"> </w:t>
-      </w:r>
-      <w:r>
-        <w:t xml:space="preserve">(Faulkner,</w:t>
-      </w:r>
-      <w:r>
-        <w:t xml:space="preserve"> </w:t>
-      </w:r>
-      <w:r>
-        <w:rPr>
-          <w:iCs/>
-          <w:i/>
-        </w:rPr>
-        <w:t xml:space="preserve">Faulkner in the</w:t>
-      </w:r>
-      <w:r>
-        <w:rPr>
-          <w:iCs/>
-          <w:i/>
-        </w:rPr>
-        <w:t xml:space="preserve"> </w:t>
-      </w:r>
-      <w:r>
-        <w:rPr>
-          <w:iCs/>
-          <w:i/>
-        </w:rPr>
-        <w:t xml:space="preserve">University</w:t>
-      </w:r>
-      <w:r>
-        <w:t xml:space="preserve"> </w:t>
-      </w:r>
-      <w:r>
-        <w:t xml:space="preserve">84)</w:t>
-      </w:r>
-      <w:r>
-        <w:t xml:space="preserve">. In a sense, the prose complements the narrative structure, which also sees the past continuously returning.</w:t>
-      </w:r>
-    </w:p>
-    <w:p>
-      <w:pPr>
-        <w:pStyle w:val="BodyText"/>
-      </w:pPr>
-      <w:r>
-        <w:t xml:space="preserve">It is rare that the typography of a text is remarkable, but here too</w:t>
-      </w:r>
-      <w:r>
-        <w:t xml:space="preserve"> </w:t>
-      </w:r>
-      <w:r>
-        <w:rPr>
-          <w:iCs/>
-          <w:i/>
-        </w:rPr>
-        <w:t xml:space="preserve">Absalom, Absalom!</w:t>
-      </w:r>
-      <w:r>
-        <w:t xml:space="preserve"> </w:t>
-      </w:r>
-      <w:r>
         <w:t xml:space="preserve">distinguishes itself. Faulkner uses what can only be considered a life time’s supply of parentheses - 1278 total or 639 pairs.</w:t>
       </w:r>
       <w:r>
@@ -3371,7 +3407,7 @@
         <w:t xml:space="preserve"> </w:t>
       </w:r>
       <w:r>
-        <w:t xml:space="preserve">parentheses - putting parentheses inside other parentheses. He does this throughout the text, but most intensely in chapter 6, where the majority of the chapter is actually a parenthetical. Both the frequency and the nesting have been represented visually through the figure below.</w:t>
+        <w:t xml:space="preserve">parentheses – putting parentheses inside other parentheses. He does this throughout the text, but most intensely in chapter 6, where the majority of the chapter is actually a parenthetical. Both the frequency and the nesting have been represented visually through the figure below.</w:t>
       </w:r>
     </w:p>
     <w:p>
@@ -3464,7 +3500,7 @@
         <w:t xml:space="preserve"> </w:t>
       </w:r>
       <w:r>
-        <w:t xml:space="preserve">- the text that is not parenthetical. To some extent this appears indistinguishable from the first nesting level: (). In part, this is simply the consequence of trying to cram too many data points into a small space, but it also demonstrates the ubiquity of parenthetical phrases. With some regularity, this first level nesting is further enframed with second level nesting: (()). The most intense usage of nesting is in chapter 6. In the first couple of pages, the narrative jumps to level one nesting, then second level, and even third ((())), until finally at the apex of the chart Quentin is nested four levels deep, or more colloquially, he is an aside to an aside to an aside to an aside. It is likely a happy accident that Quentin’s name is the only one that is so deeply nested, it is certainly unreasonable to expect any reader to discover this Easter egg without considerable effort. To be sure, it is possible that Faulkner himself lost track of the parenthesis, the number of parenthesis in this chapter is uneven. Nevertheless, to find Quentin dead-center in the text at the deepest parenthetical level reinforces how much</w:t>
+        <w:t xml:space="preserve">– the text that is not parenthetical. To some extent this appears indistinguishable from the first nesting level: (). In part, this is simply the consequence of trying to plot too many data points into a small space, but it also demonstrates the ubiquity of parenthetical phrases. With some regularity, this first level nesting is further enframed with second level nesting: (()). The most intense usage of nesting is in chapter 6. In the first couple of pages, the narrative jumps to level one nesting, then second level, and even third ((())), until finally at the apex of the chart Quentin is nested four levels deep, or more colloquially, he is an aside to an aside to an aside to an aside. It is likely a happy accident that Quentin’s name is the only one that is so deeply nested, it is certainly unreasonable to expect any reader to discover this Easter egg without considerable effort. To be sure, it is possible that Faulkner himself lost track of the parenthesis as the number of parenthesis in this chapter is uneven. Formally, there should be an extra closing parenthesis at the end of chapter 6. Nevertheless, to find Quentin dead-center in the text at the deepest parenthetical level reinforces how much</w:t>
       </w:r>
       <w:r>
         <w:t xml:space="preserve"> </w:t>
@@ -3480,7 +3516,28 @@
         <w:t xml:space="preserve"> </w:t>
       </w:r>
       <w:r>
-        <w:t xml:space="preserve">is about his confrontation with the past, as it is about the sordid history of the Sutpens.</w:t>
+        <w:t xml:space="preserve">is about his confrontation with the past, as it is about the sordid history of the Sutpens. In many respects that makes him the main character, or as Alex Vernon points out,</w:t>
+      </w:r>
+      <w:r>
+        <w:t xml:space="preserve"> </w:t>
+      </w:r>
+      <w:r>
+        <w:t xml:space="preserve">“</w:t>
+      </w:r>
+      <w:r>
+        <w:t xml:space="preserve">Every other voice in the text comes to us through Quentin</w:t>
+      </w:r>
+      <w:r>
+        <w:t xml:space="preserve">”</w:t>
+      </w:r>
+      <w:r>
+        <w:t xml:space="preserve"> </w:t>
+      </w:r>
+      <w:r>
+        <w:t xml:space="preserve">(Vernon 164)</w:t>
+      </w:r>
+      <w:r>
+        <w:t xml:space="preserve">.</w:t>
       </w:r>
     </w:p>
     <w:p>
@@ -3585,16 +3642,16 @@
         <w:t xml:space="preserve">“</w:t>
       </w:r>
       <w:r>
-        <w:t xml:space="preserve">Then I could give you a decent stall in the stable’ and turned and went out</w:t>
-      </w:r>
-      <w:r>
-        <w:t xml:space="preserve">”</w:t>
-      </w:r>
-      <w:r>
-        <w:t xml:space="preserve"> </w:t>
-      </w:r>
-      <w:r>
-        <w:t xml:space="preserve">is repeated verbatim twice (151, 229). Meanwhile, the four-word phrase,</w:t>
+        <w:t xml:space="preserve">Then I could give you a decent stall in the stable’ and turned and went out.</w:t>
+      </w:r>
+      <w:r>
+        <w:t xml:space="preserve">”</w:t>
+      </w:r>
+      <w:r>
+        <w:t xml:space="preserve"> </w:t>
+      </w:r>
+      <w:r>
+        <w:t xml:space="preserve">It is repeated verbatim twice (151, 229). Meanwhile, the four-word phrase,</w:t>
       </w:r>
       <w:r>
         <w:t xml:space="preserve"> </w:t>
@@ -3620,7 +3677,7 @@
         <w:pStyle w:val="BodyText"/>
       </w:pPr>
       <w:r>
-        <w:t xml:space="preserve">Counting ngrams is necessarily a crude measure. It does not take into account very minor variations in phrasing. Rosa repeats the phrase</w:t>
+        <w:t xml:space="preserve">Counting n-grams is necessarily a crude measure. It does not take into account very minor variations in phrasing. Rosa repeats the phrase</w:t>
       </w:r>
       <w:r>
         <w:t xml:space="preserve"> </w:t>
@@ -3731,7 +3788,7 @@
         <w:t xml:space="preserve"> </w:t>
       </w:r>
       <w:r>
-        <w:t xml:space="preserve">is repeated seven times, but does not feel particularly unique to the text. Still, it is possible to get a better sense of what role these repetitions play cross matching them with the characters that appear in the events where they occur. Some characters share common phrases, Charles, Henry, Judith, and Sutpen all appear in events with the phrase</w:t>
+        <w:t xml:space="preserve">is repeated seven times, but does not feel particularly unique to the text. Still, it is possible to get a better sense of what role these repetitions play by cross matching them with the characters that appear in the events where they occur. Some characters share common phrases, Charles, Henry, Judith, and Sutpen all appear in events with the phrase</w:t>
       </w:r>
       <w:r>
         <w:t xml:space="preserve"> </w:t>
@@ -3749,7 +3806,7 @@
         <w:t xml:space="preserve"> </w:t>
       </w:r>
       <w:r>
-        <w:t xml:space="preserve">The Sutpen men all share the common ngram</w:t>
+        <w:t xml:space="preserve">The Sutpen men all share the common n-gram</w:t>
       </w:r>
       <w:r>
         <w:t xml:space="preserve"> </w:t>
@@ -3825,8 +3882,69 @@
         <w:t xml:space="preserve">Conclusion</w:t>
       </w:r>
     </w:p>
+    <w:p>
+      <w:pPr>
+        <w:pStyle w:val="FirstParagraph"/>
+      </w:pPr>
+      <w:r>
+        <w:t xml:space="preserve">The preceding vignettes cover only a fraction of the type of analysis that is possible with the</w:t>
+      </w:r>
+      <w:r>
+        <w:t xml:space="preserve"> </w:t>
+      </w:r>
+      <w:r>
+        <w:rPr>
+          <w:iCs/>
+          <w:i/>
+        </w:rPr>
+        <w:t xml:space="preserve">DY</w:t>
+      </w:r>
+      <w:r>
+        <w:t xml:space="preserve"> </w:t>
+      </w:r>
+      <w:r>
+        <w:t xml:space="preserve">data. In some sense, this is property inherent to all databases: they make relationships between entities explicit that would otherwise be hard to detect. In another sense, the multiplicity of analyses is also idiosyncratic to</w:t>
+      </w:r>
+      <w:r>
+        <w:t xml:space="preserve"> </w:t>
+      </w:r>
+      <w:r>
+        <w:rPr>
+          <w:iCs/>
+          <w:i/>
+        </w:rPr>
+        <w:t xml:space="preserve">Absalom, Absalom!</w:t>
+      </w:r>
+      <w:r>
+        <w:t xml:space="preserve">, a text that categorically resists closure and requires constantly new interpretations. Nevertheless, it is possible to draw a large circle around its major themes and show how these cluster together. The characters, locations, events, and language all try to reconcile the South’s racial past with its present only to suggest that this reconciliation is not possible. There will always be a disjunction between that which happened and that which is now happening.</w:t>
+      </w:r>
+    </w:p>
+    <w:p>
+      <w:pPr>
+        <w:pStyle w:val="BodyText"/>
+      </w:pPr>
+      <w:r>
+        <w:t xml:space="preserve">A common way to deal with this disjunction is to talk over it by telling a story, usually one with a happy ending. The storytellings in</w:t>
+      </w:r>
+      <w:r>
+        <w:t xml:space="preserve"> </w:t>
+      </w:r>
+      <w:r>
+        <w:rPr>
+          <w:iCs/>
+          <w:i/>
+        </w:rPr>
+        <w:t xml:space="preserve">Absalom, Absalom!</w:t>
+      </w:r>
+      <w:r>
+        <w:t xml:space="preserve"> </w:t>
+      </w:r>
+      <w:r>
+        <w:t xml:space="preserve">underscore that the telling cannot be separated from the tale and the teller. How a narrator speaks of characters is dependent on what character the narrator identifies with, the places spoken about depend on the place spoken from, the understanding of the past depends on the time the present is in, and the language spoken with depends on the listener spoken to. In the end, there is no conclusion to the conversation about race in America, only repetition. The conversation appears to be the point though. By never allowing the text to truly ever close, Faulkner forces readers to critically re-examine their own relationships with the past, and, in turn, they relationships with themselves. It is only through this examination of the self that an understanding of the other becomes possible.</w:t>
+      </w:r>
+    </w:p>
     <w:bookmarkEnd w:id="45"/>
-    <w:bookmarkStart w:id="81" w:name="references"/>
+    <w:bookmarkStart w:id="91" w:name="references"/>
     <w:p>
       <w:pPr>
         <w:pStyle w:val="Heading2"/>
@@ -3835,7 +3953,7 @@
         <w:t xml:space="preserve">References</w:t>
       </w:r>
     </w:p>
-    <w:bookmarkStart w:id="80" w:name="refs"/>
+    <w:bookmarkStart w:id="90" w:name="refs"/>
     <w:bookmarkStart w:id="46" w:name="ref-RN40"/>
     <w:p>
       <w:pPr>
@@ -4084,12 +4202,79 @@
       </w:r>
     </w:p>
     <w:bookmarkEnd w:id="50"/>
-    <w:bookmarkStart w:id="52" w:name="ref-burgersNarrativeStructureAnalysis"/>
+    <w:bookmarkStart w:id="52" w:name="X15045d4223032613d49b0c63eafac3cbd04016e"/>
     <w:p>
       <w:pPr>
         <w:pStyle w:val="Bibliography"/>
       </w:pPr>
       <w:r>
+        <w:t xml:space="preserve">Brooks, Peter.</w:t>
+      </w:r>
+      <w:r>
+        <w:t xml:space="preserve"> </w:t>
+      </w:r>
+      <w:r>
+        <w:t xml:space="preserve">“Incredulous</w:t>
+      </w:r>
+      <w:r>
+        <w:t xml:space="preserve"> </w:t>
+      </w:r>
+      <w:r>
+        <w:t xml:space="preserve">Narration</w:t>
+      </w:r>
+      <w:r>
+        <w:t xml:space="preserve">:</w:t>
+      </w:r>
+      <w:r>
+        <w:t xml:space="preserve"> </w:t>
+      </w:r>
+      <w:r>
+        <w:t xml:space="preserve">Absalom</w:t>
+      </w:r>
+      <w:r>
+        <w:t xml:space="preserve">,</w:t>
+      </w:r>
+      <w:r>
+        <w:t xml:space="preserve"> </w:t>
+      </w:r>
+      <w:r>
+        <w:t xml:space="preserve">Absalom</w:t>
+      </w:r>
+      <w:r>
+        <w:t xml:space="preserve">!”</w:t>
+      </w:r>
+      <w:r>
+        <w:t xml:space="preserve"> </w:t>
+      </w:r>
+      <w:r>
+        <w:rPr>
+          <w:iCs/>
+          <w:i/>
+        </w:rPr>
+        <w:t xml:space="preserve">Comparative Literature</w:t>
+      </w:r>
+      <w:r>
+        <w:t xml:space="preserve">, vol. 34, no. 3, 1982, pp. 247–68, doi:</w:t>
+      </w:r>
+      <w:hyperlink r:id="rId51">
+        <w:r>
+          <w:rPr>
+            <w:rStyle w:val="Hyperlink"/>
+          </w:rPr>
+          <w:t xml:space="preserve">10.2307/1770556</w:t>
+        </w:r>
+      </w:hyperlink>
+      <w:r>
+        <w:t xml:space="preserve">.</w:t>
+      </w:r>
+    </w:p>
+    <w:bookmarkEnd w:id="52"/>
+    <w:bookmarkStart w:id="54" w:name="ref-burgersNarrativeStructureAnalysis"/>
+    <w:p>
+      <w:pPr>
+        <w:pStyle w:val="Bibliography"/>
+      </w:pPr>
+      <w:r>
         <w:t xml:space="preserve">Burgers, Johannes.</w:t>
       </w:r>
       <w:r>
@@ -4129,7 +4314,7 @@
       <w:r>
         <w:t xml:space="preserve"> </w:t>
       </w:r>
-      <w:hyperlink r:id="rId51">
+      <w:hyperlink r:id="rId53">
         <w:r>
           <w:rPr>
             <w:rStyle w:val="Hyperlink"/>
@@ -4141,8 +4326,8 @@
         <w:t xml:space="preserve">. Accessed 5 June 2021.</w:t>
       </w:r>
     </w:p>
-    <w:bookmarkEnd w:id="52"/>
-    <w:bookmarkStart w:id="54" w:name="ref-chacomaHeapsLawHeaps"/>
+    <w:bookmarkEnd w:id="54"/>
+    <w:bookmarkStart w:id="56" w:name="ref-chacomaHeapsLawHeaps"/>
     <w:p>
       <w:pPr>
         <w:pStyle w:val="Bibliography"/>
@@ -4193,7 +4378,7 @@
       <w:r>
         <w:t xml:space="preserve">, vol. 7, no. 3, p. 200008, doi:</w:t>
       </w:r>
-      <w:hyperlink r:id="rId53">
+      <w:hyperlink r:id="rId55">
         <w:r>
           <w:rPr>
             <w:rStyle w:val="Hyperlink"/>
@@ -4205,13 +4390,64 @@
         <w:t xml:space="preserve">. Accessed 5 June 2021.</w:t>
       </w:r>
     </w:p>
-    <w:bookmarkEnd w:id="54"/>
-    <w:bookmarkStart w:id="56" w:name="ref-RN29"/>
+    <w:bookmarkEnd w:id="56"/>
+    <w:bookmarkStart w:id="57" w:name="ref-RN16"/>
     <w:p>
       <w:pPr>
         <w:pStyle w:val="Bibliography"/>
       </w:pPr>
       <w:r>
+        <w:t xml:space="preserve">Doyle, Don Harrison.</w:t>
+      </w:r>
+      <w:r>
+        <w:t xml:space="preserve"> </w:t>
+      </w:r>
+      <w:r>
+        <w:rPr>
+          <w:iCs/>
+          <w:i/>
+        </w:rPr>
+        <w:t xml:space="preserve">Faulkner’s County:</w:t>
+      </w:r>
+      <w:r>
+        <w:rPr>
+          <w:iCs/>
+          <w:i/>
+        </w:rPr>
+        <w:t xml:space="preserve"> </w:t>
+      </w:r>
+      <w:r>
+        <w:rPr>
+          <w:iCs/>
+          <w:i/>
+        </w:rPr>
+        <w:t xml:space="preserve">The</w:t>
+      </w:r>
+      <w:r>
+        <w:rPr>
+          <w:iCs/>
+          <w:i/>
+        </w:rPr>
+        <w:t xml:space="preserve"> </w:t>
+      </w:r>
+      <w:r>
+        <w:rPr>
+          <w:iCs/>
+          <w:i/>
+        </w:rPr>
+        <w:t xml:space="preserve">Historical Roots of Yoknapatawpha</w:t>
+      </w:r>
+      <w:r>
+        <w:t xml:space="preserve">. University of North Carolina Press, 2001.</w:t>
+      </w:r>
+    </w:p>
+    <w:bookmarkEnd w:id="57"/>
+    <w:bookmarkStart w:id="59" w:name="ref-RN29"/>
+    <w:p>
+      <w:pPr>
+        <w:pStyle w:val="Bibliography"/>
+      </w:pPr>
+      <w:r>
         <w:t xml:space="preserve">Egan, Philip J.</w:t>
       </w:r>
       <w:r>
@@ -4233,7 +4469,7 @@
       <w:r>
         <w:t xml:space="preserve">, vol. 55, no. 2, 1983, pp. 199–214, doi:</w:t>
       </w:r>
-      <w:hyperlink r:id="rId55">
+      <w:hyperlink r:id="rId58">
         <w:r>
           <w:rPr>
             <w:rStyle w:val="Hyperlink"/>
@@ -4245,8 +4481,8 @@
         <w:t xml:space="preserve">.</w:t>
       </w:r>
     </w:p>
-    <w:bookmarkEnd w:id="56"/>
-    <w:bookmarkStart w:id="57" w:name="ref-RN35"/>
+    <w:bookmarkEnd w:id="59"/>
+    <w:bookmarkStart w:id="60" w:name="ref-RN35"/>
     <w:p>
       <w:pPr>
         <w:pStyle w:val="Bibliography"/>
@@ -4268,8 +4504,8 @@
         <w:t xml:space="preserve">. Facts On File, Incorporated, 2009.</w:t>
       </w:r>
     </w:p>
-    <w:bookmarkEnd w:id="57"/>
-    <w:bookmarkStart w:id="58" w:name="ref-RN23"/>
+    <w:bookmarkEnd w:id="60"/>
+    <w:bookmarkStart w:id="61" w:name="ref-RN23"/>
     <w:p>
       <w:pPr>
         <w:pStyle w:val="Bibliography"/>
@@ -4319,8 +4555,8 @@
         <w:t xml:space="preserve">. Vintage Books, 1990.</w:t>
       </w:r>
     </w:p>
-    <w:bookmarkEnd w:id="58"/>
-    <w:bookmarkStart w:id="59" w:name="ref-faulknerFaulknerUniversityClass1965"/>
+    <w:bookmarkEnd w:id="61"/>
+    <w:bookmarkStart w:id="62" w:name="ref-faulknerFaulknerUniversityClass1965"/>
     <w:p>
       <w:pPr>
         <w:pStyle w:val="Bibliography"/>
@@ -4454,8 +4690,8 @@
         <w:t xml:space="preserve">. Vintage Books, 1965.</w:t>
       </w:r>
     </w:p>
-    <w:bookmarkEnd w:id="59"/>
-    <w:bookmarkStart w:id="60" w:name="ref-forsterAspectsNovel1927"/>
+    <w:bookmarkEnd w:id="62"/>
+    <w:bookmarkStart w:id="63" w:name="ref-forsterAspectsNovel1927"/>
     <w:p>
       <w:pPr>
         <w:pStyle w:val="Bibliography"/>
@@ -4477,8 +4713,8 @@
         <w:t xml:space="preserve">. 1927.</w:t>
       </w:r>
     </w:p>
-    <w:bookmarkEnd w:id="60"/>
-    <w:bookmarkStart w:id="61" w:name="ref-goddenAbsalomAbsalomHaiti1994"/>
+    <w:bookmarkEnd w:id="63"/>
+    <w:bookmarkStart w:id="64" w:name="ref-goddenAbsalomAbsalomHaiti1994"/>
     <w:p>
       <w:pPr>
         <w:pStyle w:val="Bibliography"/>
@@ -4563,8 +4799,8 @@
         <w:t xml:space="preserve">, vol. 61, no. 3, 1994, pp. 685–720.</w:t>
       </w:r>
     </w:p>
-    <w:bookmarkEnd w:id="61"/>
-    <w:bookmarkStart w:id="63" w:name="ref-haExtendingZipfLaw2009"/>
+    <w:bookmarkEnd w:id="64"/>
+    <w:bookmarkStart w:id="66" w:name="ref-haExtendingZipfLaw2009"/>
     <w:p>
       <w:pPr>
         <w:pStyle w:val="Bibliography"/>
@@ -4600,7 +4836,7 @@
       <w:r>
         <w:t xml:space="preserve">, vol. 32, no. 1, Dec. 2009, pp. 101–13, doi:</w:t>
       </w:r>
-      <w:hyperlink r:id="rId62">
+      <w:hyperlink r:id="rId65">
         <w:r>
           <w:rPr>
             <w:rStyle w:val="Hyperlink"/>
@@ -4612,13 +4848,255 @@
         <w:t xml:space="preserve">.</w:t>
       </w:r>
     </w:p>
-    <w:bookmarkEnd w:id="63"/>
-    <w:bookmarkStart w:id="64" w:name="ref-RN33"/>
+    <w:bookmarkEnd w:id="66"/>
+    <w:bookmarkStart w:id="68" w:name="ref-hodgsonLogicalSequenceContinuity1971"/>
     <w:p>
       <w:pPr>
         <w:pStyle w:val="Bibliography"/>
       </w:pPr>
       <w:r>
+        <w:t xml:space="preserve">Hodgson, John A.</w:t>
+      </w:r>
+      <w:r>
+        <w:t xml:space="preserve"> </w:t>
+      </w:r>
+      <w:r>
+        <w:t xml:space="preserve">“"</w:t>
+      </w:r>
+      <w:r>
+        <w:t xml:space="preserve">Logical</w:t>
+      </w:r>
+      <w:r>
+        <w:t xml:space="preserve"> </w:t>
+      </w:r>
+      <w:r>
+        <w:t xml:space="preserve">Sequence</w:t>
+      </w:r>
+      <w:r>
+        <w:t xml:space="preserve"> </w:t>
+      </w:r>
+      <w:r>
+        <w:t xml:space="preserve">and</w:t>
+      </w:r>
+      <w:r>
+        <w:t xml:space="preserve"> </w:t>
+      </w:r>
+      <w:r>
+        <w:t xml:space="preserve">Continuity</w:t>
+      </w:r>
+      <w:r>
+        <w:t xml:space="preserve">":</w:t>
+      </w:r>
+      <w:r>
+        <w:t xml:space="preserve"> </w:t>
+      </w:r>
+      <w:r>
+        <w:t xml:space="preserve">Some</w:t>
+      </w:r>
+      <w:r>
+        <w:t xml:space="preserve"> </w:t>
+      </w:r>
+      <w:r>
+        <w:t xml:space="preserve">Observations</w:t>
+      </w:r>
+      <w:r>
+        <w:t xml:space="preserve"> </w:t>
+      </w:r>
+      <w:r>
+        <w:t xml:space="preserve">on the</w:t>
+      </w:r>
+      <w:r>
+        <w:t xml:space="preserve"> </w:t>
+      </w:r>
+      <w:r>
+        <w:t xml:space="preserve">Typographical</w:t>
+      </w:r>
+      <w:r>
+        <w:t xml:space="preserve"> </w:t>
+      </w:r>
+      <w:r>
+        <w:t xml:space="preserve">and</w:t>
+      </w:r>
+      <w:r>
+        <w:t xml:space="preserve"> </w:t>
+      </w:r>
+      <w:r>
+        <w:t xml:space="preserve">Structural</w:t>
+      </w:r>
+      <w:r>
+        <w:t xml:space="preserve"> </w:t>
+      </w:r>
+      <w:r>
+        <w:t xml:space="preserve">Consistency</w:t>
+      </w:r>
+      <w:r>
+        <w:t xml:space="preserve"> </w:t>
+      </w:r>
+      <w:r>
+        <w:t xml:space="preserve">of</w:t>
+      </w:r>
+      <w:r>
+        <w:t xml:space="preserve"> </w:t>
+      </w:r>
+      <w:r>
+        <w:t xml:space="preserve">Absalom</w:t>
+      </w:r>
+      <w:r>
+        <w:t xml:space="preserve">,</w:t>
+      </w:r>
+      <w:r>
+        <w:t xml:space="preserve"> </w:t>
+      </w:r>
+      <w:r>
+        <w:t xml:space="preserve">Absalom</w:t>
+      </w:r>
+      <w:r>
+        <w:t xml:space="preserve">!”</w:t>
+      </w:r>
+      <w:r>
+        <w:t xml:space="preserve"> </w:t>
+      </w:r>
+      <w:r>
+        <w:rPr>
+          <w:iCs/>
+          <w:i/>
+        </w:rPr>
+        <w:t xml:space="preserve">American Literature</w:t>
+      </w:r>
+      <w:r>
+        <w:t xml:space="preserve">, vol. 43, no. 1, 1971, pp. 97–107, doi:</w:t>
+      </w:r>
+      <w:hyperlink r:id="rId67">
+        <w:r>
+          <w:rPr>
+            <w:rStyle w:val="Hyperlink"/>
+          </w:rPr>
+          <w:t xml:space="preserve">10.2307/2924482</w:t>
+        </w:r>
+      </w:hyperlink>
+      <w:r>
+        <w:t xml:space="preserve">.</w:t>
+      </w:r>
+    </w:p>
+    <w:bookmarkEnd w:id="68"/>
+    <w:bookmarkStart w:id="70" w:name="ref-laddDirectionHowlingNationalism1994"/>
+    <w:p>
+      <w:pPr>
+        <w:pStyle w:val="Bibliography"/>
+      </w:pPr>
+      <w:r>
+        <w:t xml:space="preserve">Ladd, Barbara.</w:t>
+      </w:r>
+      <w:r>
+        <w:t xml:space="preserve"> </w:t>
+      </w:r>
+      <w:r>
+        <w:t xml:space="preserve">“"</w:t>
+      </w:r>
+      <w:r>
+        <w:t xml:space="preserve">The</w:t>
+      </w:r>
+      <w:r>
+        <w:t xml:space="preserve"> </w:t>
+      </w:r>
+      <w:r>
+        <w:t xml:space="preserve">Direction</w:t>
+      </w:r>
+      <w:r>
+        <w:t xml:space="preserve"> </w:t>
+      </w:r>
+      <w:r>
+        <w:t xml:space="preserve">of the</w:t>
+      </w:r>
+      <w:r>
+        <w:t xml:space="preserve"> </w:t>
+      </w:r>
+      <w:r>
+        <w:t xml:space="preserve">Howling</w:t>
+      </w:r>
+      <w:r>
+        <w:t xml:space="preserve">":</w:t>
+      </w:r>
+      <w:r>
+        <w:t xml:space="preserve"> </w:t>
+      </w:r>
+      <w:r>
+        <w:t xml:space="preserve">Nationalism</w:t>
+      </w:r>
+      <w:r>
+        <w:t xml:space="preserve"> </w:t>
+      </w:r>
+      <w:r>
+        <w:t xml:space="preserve">and the</w:t>
+      </w:r>
+      <w:r>
+        <w:t xml:space="preserve"> </w:t>
+      </w:r>
+      <w:r>
+        <w:t xml:space="preserve">Color</w:t>
+      </w:r>
+      <w:r>
+        <w:t xml:space="preserve"> </w:t>
+      </w:r>
+      <w:r>
+        <w:t xml:space="preserve">Line</w:t>
+      </w:r>
+      <w:r>
+        <w:t xml:space="preserve"> </w:t>
+      </w:r>
+      <w:r>
+        <w:t xml:space="preserve">in</w:t>
+      </w:r>
+      <w:r>
+        <w:t xml:space="preserve"> </w:t>
+      </w:r>
+      <w:r>
+        <w:t xml:space="preserve">Absalom</w:t>
+      </w:r>
+      <w:r>
+        <w:t xml:space="preserve">,</w:t>
+      </w:r>
+      <w:r>
+        <w:t xml:space="preserve"> </w:t>
+      </w:r>
+      <w:r>
+        <w:t xml:space="preserve">Absalom</w:t>
+      </w:r>
+      <w:r>
+        <w:t xml:space="preserve">!”</w:t>
+      </w:r>
+      <w:r>
+        <w:t xml:space="preserve"> </w:t>
+      </w:r>
+      <w:r>
+        <w:rPr>
+          <w:iCs/>
+          <w:i/>
+        </w:rPr>
+        <w:t xml:space="preserve">American Literature</w:t>
+      </w:r>
+      <w:r>
+        <w:t xml:space="preserve">, vol. 66, no. 3, 1994, pp. 525–51, doi:</w:t>
+      </w:r>
+      <w:hyperlink r:id="rId69">
+        <w:r>
+          <w:rPr>
+            <w:rStyle w:val="Hyperlink"/>
+          </w:rPr>
+          <w:t xml:space="preserve">10.2307/2927603</w:t>
+        </w:r>
+      </w:hyperlink>
+      <w:r>
+        <w:t xml:space="preserve">.</w:t>
+      </w:r>
+    </w:p>
+    <w:bookmarkEnd w:id="70"/>
+    <w:bookmarkStart w:id="71" w:name="ref-RN33"/>
+    <w:p>
+      <w:pPr>
+        <w:pStyle w:val="Bibliography"/>
+      </w:pPr>
+      <w:r>
         <w:t xml:space="preserve">Langford, Gerald.</w:t>
       </w:r>
       <w:r>
@@ -4820,8 +5298,8 @@
         <w:t xml:space="preserve">. University of Texas Press, 2015.</w:t>
       </w:r>
     </w:p>
-    <w:bookmarkEnd w:id="64"/>
-    <w:bookmarkStart w:id="65" w:name="ref-RN32"/>
+    <w:bookmarkEnd w:id="71"/>
+    <w:bookmarkStart w:id="72" w:name="ref-RN32"/>
     <w:p>
       <w:pPr>
         <w:pStyle w:val="Bibliography"/>
@@ -4876,8 +5354,8 @@
         <w:t xml:space="preserve">, vol. 15, no. 2, 1979, p. 333.</w:t>
       </w:r>
     </w:p>
-    <w:bookmarkEnd w:id="65"/>
-    <w:bookmarkStart w:id="66" w:name="ref-matthewsRecallingWestIndies2004"/>
+    <w:bookmarkEnd w:id="72"/>
+    <w:bookmarkStart w:id="73" w:name="ref-matthewsRecallingWestIndies2004"/>
     <w:p>
       <w:pPr>
         <w:pStyle w:val="Bibliography"/>
@@ -4959,8 +5437,8 @@
         <w:t xml:space="preserve">, vol. 16, no. 2, 2004, pp. 238–62.</w:t>
       </w:r>
     </w:p>
-    <w:bookmarkEnd w:id="66"/>
-    <w:bookmarkStart w:id="67" w:name="ref-RN34"/>
+    <w:bookmarkEnd w:id="73"/>
+    <w:bookmarkStart w:id="74" w:name="ref-RN34"/>
     <w:p>
       <w:pPr>
         <w:pStyle w:val="Bibliography"/>
@@ -4982,8 +5460,8 @@
         <w:t xml:space="preserve">. Bantam Books, 1983.</w:t>
       </w:r>
     </w:p>
-    <w:bookmarkEnd w:id="67"/>
-    <w:bookmarkStart w:id="68" w:name="ref-pinkerLanguageInstinctHow1995"/>
+    <w:bookmarkEnd w:id="74"/>
+    <w:bookmarkStart w:id="75" w:name="ref-pinkerLanguageInstinctHow1995"/>
     <w:p>
       <w:pPr>
         <w:pStyle w:val="Bibliography"/>
@@ -5110,8 +5588,8 @@
         <w:t xml:space="preserve">. Harper Collins, 1995.</w:t>
       </w:r>
     </w:p>
-    <w:bookmarkEnd w:id="68"/>
-    <w:bookmarkStart w:id="69" w:name="ref-RN27"/>
+    <w:bookmarkEnd w:id="75"/>
+    <w:bookmarkStart w:id="76" w:name="ref-RN27"/>
     <w:p>
       <w:pPr>
         <w:pStyle w:val="Bibliography"/>
@@ -5193,8 +5671,8 @@
         <w:t xml:space="preserve">, vol. 49, 2016, pp. 101–21.</w:t>
       </w:r>
     </w:p>
-    <w:bookmarkEnd w:id="69"/>
-    <w:bookmarkStart w:id="70" w:name="ref-raileyNaturalAristocracyHistory1999b"/>
+    <w:bookmarkEnd w:id="76"/>
+    <w:bookmarkStart w:id="77" w:name="ref-raileyNaturalAristocracyHistory1999b"/>
     <w:p>
       <w:pPr>
         <w:pStyle w:val="Bibliography"/>
@@ -5335,8 +5813,8 @@
         <w:t xml:space="preserve">. University of Alabama Press, 1999.</w:t>
       </w:r>
     </w:p>
-    <w:bookmarkEnd w:id="70"/>
-    <w:bookmarkStart w:id="72" w:name="ref-randelParenthesesFaulknerAbsalom1971"/>
+    <w:bookmarkEnd w:id="77"/>
+    <w:bookmarkStart w:id="79" w:name="ref-randelParenthesesFaulknerAbsalom1971"/>
     <w:p>
       <w:pPr>
         <w:pStyle w:val="Bibliography"/>
@@ -5416,7 +5894,7 @@
       <w:r>
         <w:t xml:space="preserve"> </w:t>
       </w:r>
-      <w:hyperlink r:id="rId71">
+      <w:hyperlink r:id="rId78">
         <w:r>
           <w:rPr>
             <w:rStyle w:val="Hyperlink"/>
@@ -5428,8 +5906,8 @@
         <w:t xml:space="preserve">.</w:t>
       </w:r>
     </w:p>
-    <w:bookmarkEnd w:id="72"/>
-    <w:bookmarkStart w:id="74" w:name="Xd3029ae36e1025e3492eadd3ff75d2310d137a7"/>
+    <w:bookmarkEnd w:id="79"/>
+    <w:bookmarkStart w:id="81" w:name="Xd3029ae36e1025e3492eadd3ff75d2310d137a7"/>
     <w:p>
       <w:pPr>
         <w:pStyle w:val="Bibliography"/>
@@ -5495,7 +5973,7 @@
       <w:r>
         <w:t xml:space="preserve"> </w:t>
       </w:r>
-      <w:hyperlink r:id="rId73">
+      <w:hyperlink r:id="rId80">
         <w:r>
           <w:rPr>
             <w:rStyle w:val="Hyperlink"/>
@@ -5507,8 +5985,8 @@
         <w:t xml:space="preserve">.</w:t>
       </w:r>
     </w:p>
-    <w:bookmarkEnd w:id="74"/>
-    <w:bookmarkStart w:id="75" w:name="ref-RN24"/>
+    <w:bookmarkEnd w:id="81"/>
+    <w:bookmarkStart w:id="82" w:name="ref-RN24"/>
     <w:p>
       <w:pPr>
         <w:pStyle w:val="Bibliography"/>
@@ -5635,8 +6113,8 @@
         <w:t xml:space="preserve">. Harvard University Press, 2009.</w:t>
       </w:r>
     </w:p>
-    <w:bookmarkEnd w:id="75"/>
-    <w:bookmarkStart w:id="76" w:name="ref-RN37"/>
+    <w:bookmarkEnd w:id="82"/>
+    <w:bookmarkStart w:id="83" w:name="ref-RN37"/>
     <w:p>
       <w:pPr>
         <w:pStyle w:val="Bibliography"/>
@@ -5812,8 +6290,8 @@
         <w:t xml:space="preserve">, edited by Richard J. Whitt, John Benjamins Publishing Company, 2018.</w:t>
       </w:r>
     </w:p>
-    <w:bookmarkEnd w:id="76"/>
-    <w:bookmarkStart w:id="77" w:name="ref-RN26"/>
+    <w:bookmarkEnd w:id="83"/>
+    <w:bookmarkStart w:id="84" w:name="ref-RN26"/>
     <w:p>
       <w:pPr>
         <w:pStyle w:val="Bibliography"/>
@@ -5982,8 +6460,8 @@
         <w:t xml:space="preserve">, edited by Werner Sollors, Oxford University Press, 2000, pp. xiii, 546 p.</w:t>
       </w:r>
     </w:p>
-    <w:bookmarkEnd w:id="77"/>
-    <w:bookmarkStart w:id="78" w:name="ref-shklovskiiTheoryProse1990"/>
+    <w:bookmarkEnd w:id="84"/>
+    <w:bookmarkStart w:id="85" w:name="ref-shklovskiiTheoryProse1990"/>
     <w:p>
       <w:pPr>
         <w:pStyle w:val="Bibliography"/>
@@ -6005,8 +6483,8 @@
         <w:t xml:space="preserve">. Translated by Benjamin Sher, Dalkey Archive Press, 1990.</w:t>
       </w:r>
     </w:p>
-    <w:bookmarkEnd w:id="78"/>
-    <w:bookmarkStart w:id="79" w:name="ref-stanchichHiddenCaribbeanOther1996"/>
+    <w:bookmarkEnd w:id="85"/>
+    <w:bookmarkStart w:id="86" w:name="ref-stanchichHiddenCaribbeanOther1996"/>
     <w:p>
       <w:pPr>
         <w:pStyle w:val="Bibliography"/>
@@ -6136,9 +6614,195 @@
         <w:t xml:space="preserve">, vol. 49, no. 3, 1996, pp. 603–17.</w:t>
       </w:r>
     </w:p>
-    <w:bookmarkEnd w:id="79"/>
-    <w:bookmarkEnd w:id="80"/>
-    <w:bookmarkEnd w:id="81"/>
+    <w:bookmarkEnd w:id="86"/>
+    <w:bookmarkStart w:id="87" w:name="X1ab3f68897ac1ac69a33a074ab9354b6ff50e04"/>
+    <w:p>
+      <w:pPr>
+        <w:pStyle w:val="Bibliography"/>
+      </w:pPr>
+      <w:r>
+        <w:t xml:space="preserve">Vernon, Alex.</w:t>
+      </w:r>
+      <w:r>
+        <w:t xml:space="preserve"> </w:t>
+      </w:r>
+      <w:r>
+        <w:t xml:space="preserve">“Narrative</w:t>
+      </w:r>
+      <w:r>
+        <w:t xml:space="preserve"> </w:t>
+      </w:r>
+      <w:r>
+        <w:t xml:space="preserve">Miscegenation</w:t>
+      </w:r>
+      <w:r>
+        <w:t xml:space="preserve">: "</w:t>
+      </w:r>
+      <w:r>
+        <w:t xml:space="preserve">Absalom</w:t>
+      </w:r>
+      <w:r>
+        <w:t xml:space="preserve">,</w:t>
+      </w:r>
+      <w:r>
+        <w:t xml:space="preserve"> </w:t>
+      </w:r>
+      <w:r>
+        <w:t xml:space="preserve">Absalom</w:t>
+      </w:r>
+      <w:r>
+        <w:t xml:space="preserve">!" As</w:t>
+      </w:r>
+      <w:r>
+        <w:t xml:space="preserve"> </w:t>
+      </w:r>
+      <w:r>
+        <w:t xml:space="preserve">Naturalist</w:t>
+      </w:r>
+      <w:r>
+        <w:t xml:space="preserve"> </w:t>
+      </w:r>
+      <w:r>
+        <w:t xml:space="preserve">Novel</w:t>
+      </w:r>
+      <w:r>
+        <w:t xml:space="preserve">,</w:t>
+      </w:r>
+      <w:r>
+        <w:t xml:space="preserve"> </w:t>
+      </w:r>
+      <w:r>
+        <w:t xml:space="preserve">Auto</w:t>
+      </w:r>
+      <w:r>
+        <w:t xml:space="preserve">/</w:t>
+      </w:r>
+      <w:r>
+        <w:t xml:space="preserve">Biography</w:t>
+      </w:r>
+      <w:r>
+        <w:t xml:space="preserve">, and</w:t>
+      </w:r>
+      <w:r>
+        <w:t xml:space="preserve"> </w:t>
+      </w:r>
+      <w:r>
+        <w:t xml:space="preserve">African</w:t>
+      </w:r>
+      <w:r>
+        <w:t xml:space="preserve">-</w:t>
+      </w:r>
+      <w:r>
+        <w:t xml:space="preserve">American</w:t>
+      </w:r>
+      <w:r>
+        <w:t xml:space="preserve"> </w:t>
+      </w:r>
+      <w:r>
+        <w:t xml:space="preserve">Oral</w:t>
+      </w:r>
+      <w:r>
+        <w:t xml:space="preserve"> </w:t>
+      </w:r>
+      <w:r>
+        <w:t xml:space="preserve">Story</w:t>
+      </w:r>
+      <w:r>
+        <w:t xml:space="preserve">.”</w:t>
+      </w:r>
+      <w:r>
+        <w:t xml:space="preserve"> </w:t>
+      </w:r>
+      <w:r>
+        <w:rPr>
+          <w:iCs/>
+          <w:i/>
+        </w:rPr>
+        <w:t xml:space="preserve">Journal of Narrative Theory</w:t>
+      </w:r>
+      <w:r>
+        <w:t xml:space="preserve">, vol. 31, no. 2, 2001, pp. 155–79.</w:t>
+      </w:r>
+    </w:p>
+    <w:bookmarkEnd w:id="87"/>
+    <w:bookmarkStart w:id="89" w:name="ref-zoellnerFaulknerProseStyle1959"/>
+    <w:p>
+      <w:pPr>
+        <w:pStyle w:val="Bibliography"/>
+      </w:pPr>
+      <w:r>
+        <w:t xml:space="preserve">Zoellner, Robert H.</w:t>
+      </w:r>
+      <w:r>
+        <w:t xml:space="preserve"> </w:t>
+      </w:r>
+      <w:r>
+        <w:t xml:space="preserve">“Faulkner’s</w:t>
+      </w:r>
+      <w:r>
+        <w:t xml:space="preserve"> </w:t>
+      </w:r>
+      <w:r>
+        <w:t xml:space="preserve">Prose</w:t>
+      </w:r>
+      <w:r>
+        <w:t xml:space="preserve"> </w:t>
+      </w:r>
+      <w:r>
+        <w:t xml:space="preserve">Style</w:t>
+      </w:r>
+      <w:r>
+        <w:t xml:space="preserve"> </w:t>
+      </w:r>
+      <w:r>
+        <w:t xml:space="preserve">in</w:t>
+      </w:r>
+      <w:r>
+        <w:t xml:space="preserve"> </w:t>
+      </w:r>
+      <w:r>
+        <w:t xml:space="preserve">Absalom</w:t>
+      </w:r>
+      <w:r>
+        <w:t xml:space="preserve">,</w:t>
+      </w:r>
+      <w:r>
+        <w:t xml:space="preserve"> </w:t>
+      </w:r>
+      <w:r>
+        <w:t xml:space="preserve">Absalom</w:t>
+      </w:r>
+      <w:r>
+        <w:t xml:space="preserve">!”</w:t>
+      </w:r>
+      <w:r>
+        <w:t xml:space="preserve"> </w:t>
+      </w:r>
+      <w:r>
+        <w:rPr>
+          <w:iCs/>
+          <w:i/>
+        </w:rPr>
+        <w:t xml:space="preserve">American Literature</w:t>
+      </w:r>
+      <w:r>
+        <w:t xml:space="preserve">, vol. 30, no. 4, 1959, pp. 486–502, doi:</w:t>
+      </w:r>
+      <w:hyperlink r:id="rId88">
+        <w:r>
+          <w:rPr>
+            <w:rStyle w:val="Hyperlink"/>
+          </w:rPr>
+          <w:t xml:space="preserve">10.2307/2922824</w:t>
+        </w:r>
+      </w:hyperlink>
+      <w:r>
+        <w:t xml:space="preserve">.</w:t>
+      </w:r>
+    </w:p>
+    <w:bookmarkEnd w:id="89"/>
+    <w:bookmarkEnd w:id="90"/>
+    <w:bookmarkEnd w:id="91"/>
     <w:sectPr>
       <w:pgSz w:w="12240" w:h="15840"/>
       <w:pgMar w:top="1440" w:right="1440" w:bottom="1440" w:left="1440" w:header="720" w:footer="720" w:gutter="0"/>

</xml_diff>

<commit_message>
Major update after substantial revisions in the prose.
</commit_message>
<xml_diff>
--- a/absalom_four_dimensions.docx
+++ b/absalom_four_dimensions.docx
@@ -123,7 +123,7 @@
         <w:t xml:space="preserve"> </w:t>
       </w:r>
       <w:r>
-        <w:t xml:space="preserve">is not a likeable text. Its structure is overwrought, its characters are inscrutable, and the prose is nearly impenetrable. There is also no shortage digressions – parenthetical, italicized, and otherwise – that force even the most forensic reader to return and re-read that which has transpired only a few lines earlier. Early on, in what could serve as a description of the narrative writ large, Mr. Compson refers to the dramatis personae of the Sutpen tragedy as</w:t>
+        <w:t xml:space="preserve">is not a likeable text. Its structure is overwrought, its characters are inscrutable, and the prose is nearly impenetrable. There is also no shortage of digressions – parenthetical, italicized, and otherwise – that force even the most forensic reader to return and re-read that which has transpired only a few lines earlier. Early on, in what could serve as a description of the narrative writ large, Mr. Compson refers to the dramatis personae of the Sutpen tragedy as</w:t>
       </w:r>
       <w:r>
         <w:t xml:space="preserve"> </w:t>
@@ -320,25 +320,25 @@
         <w:t xml:space="preserve"> </w:t>
       </w:r>
       <w:r>
-        <w:t xml:space="preserve">from multiple perspectives simultaneously. While it might be tempting to use the database to</w:t>
-      </w:r>
-      <w:r>
-        <w:t xml:space="preserve"> </w:t>
-      </w:r>
-      <w:r>
-        <w:t xml:space="preserve">“</w:t>
-      </w:r>
-      <w:r>
-        <w:t xml:space="preserve">solve</w:t>
-      </w:r>
-      <w:r>
-        <w:t xml:space="preserve">”</w:t>
-      </w:r>
-      <w:r>
-        <w:t xml:space="preserve"> </w:t>
-      </w:r>
-      <w:r>
-        <w:t xml:space="preserve">the mysteries of the text, so to speak – to make the formula react – such an approach glosses over the highly interpretive nature of textual encoding, and, more to the point, contradicts</w:t>
+        <w:t xml:space="preserve">from multiple perspectives simultaneously. While it might be tempting to use the database to get to know the</w:t>
+      </w:r>
+      <w:r>
+        <w:t xml:space="preserve"> </w:t>
+      </w:r>
+      <w:r>
+        <w:t xml:space="preserve">“</w:t>
+      </w:r>
+      <w:r>
+        <w:t xml:space="preserve">facts,</w:t>
+      </w:r>
+      <w:r>
+        <w:t xml:space="preserve">”</w:t>
+      </w:r>
+      <w:r>
+        <w:t xml:space="preserve"> </w:t>
+      </w:r>
+      <w:r>
+        <w:t xml:space="preserve">such an approach glosses over the highly interpretive nature of textual encoding, and, more to the point, contradicts</w:t>
       </w:r>
       <w:r>
         <w:t xml:space="preserve"> </w:t>
@@ -364,7 +364,7 @@
         <w:t xml:space="preserve">Absalom, Absalom!</w:t>
       </w:r>
       <w:r>
-        <w:t xml:space="preserve">, instead it consists of four loosely connected vignettes structured around different types of data visualization. Each piece covers a separate facet of the novel: characters, locations, events, and language.</w:t>
+        <w:t xml:space="preserve">, instead it consists of four loosely connected vignettes structured around different data visualizations. Each piece covers a separate facet of the novel: characters, locations, events, and language.</w:t>
       </w:r>
       <w:r>
         <w:rPr>
@@ -376,7 +376,7 @@
         <w:t xml:space="preserve"> </w:t>
       </w:r>
       <w:r>
-        <w:t xml:space="preserve">While each vignette could, arguably, be read separately, the themes echo each other: characters and race, locations and the plantation system, events and history, language and the past. These themes are still as resonant today as they were in 1936. Indeed, current conversations about America’s racial legacy are as much about history’s refusal to stay in the past, as they are about finding the language to speak about that legacy in the present.</w:t>
+        <w:t xml:space="preserve">While each vignette could, arguably, be read separately, the themes echo each other: characters and race, locations and the plantation system, events and history, language and the past. These themes are still as resonant today as they were in 1936. Indeed, current conversations about the racial legacy of America’s past are as much about history’s refusal to stay silent, as they are about finding the language to speak about that legacy in the present.</w:t>
       </w:r>
       <w:r>
         <w:t xml:space="preserve"> </w:t>
@@ -392,7 +392,7 @@
         <w:t xml:space="preserve"> </w:t>
       </w:r>
       <w:r>
-        <w:t xml:space="preserve">suggests that those discussions do not not end, but are, in fact, an end in and of themselves.</w:t>
+        <w:t xml:space="preserve">suggests that those discussions do not end, but are, in fact, an end in and of themselves.</w:t>
       </w:r>
     </w:p>
     <w:bookmarkEnd w:id="23"/>
@@ -442,7 +442,7 @@
         <w:t xml:space="preserve"> </w:t>
       </w:r>
       <w:r>
-        <w:t xml:space="preserve">is that it is not a whodunit, but rather a why-done-it. Within the first several pages, the basic facts of the case are laid out: Henry Sutpen shoots his sister’s fiance, Charles Bon, on the day of their wedding. The remainder of the narrative is dedicated to unspooling the various lines of inquiry into why Henry was motivated to shoot Bon. The answer is integral to the Sutpen family story, and serves as a commentary on the history of slavery in America more generally. In many respects, then,</w:t>
+        <w:t xml:space="preserve">is that it is not a whodunit, but rather a why-done-it. Within the first several pages, the basic facts of the case are laid out: Henry Sutpen shoots his sister’s fiancé, Charles Bon, on the day of their wedding. The remainder of the narrative is dedicated to unspooling the various lines of inquiry into why Henry was motivated to shoot Bon. The answer is integral to the Sutpen family story, and serves as a commentary on the history of slavery in America more generally. In many respects, then,</w:t>
       </w:r>
       <w:r>
         <w:t xml:space="preserve"> </w:t>
@@ -482,7 +482,25 @@
         <w:t xml:space="preserve"> </w:t>
       </w:r>
       <w:r>
-        <w:t xml:space="preserve">is particularly useful in this regard. Not only can users pull up the biographies of each individual character, it is also possible to aggregate and group the data to render a more detailed portrait of the various characters in relation to one another.</w:t>
+        <w:t xml:space="preserve">is particularly useful in this regard. Not only can users pull up the biographies of each individual character, it is also possible to aggregate and group the data to render a more detailed portrait of the various characters in relation to one another. This data is, to be sure, highly interpretive. For instance, the text suggests that Charles Bon is part Black, but this is all based on speculation, and none of the narrators have ever actually seen Bon. Nevertheless, in the database, Bon is entered as being</w:t>
+      </w:r>
+      <w:r>
+        <w:t xml:space="preserve"> </w:t>
+      </w:r>
+      <w:r>
+        <w:t xml:space="preserve">“</w:t>
+      </w:r>
+      <w:r>
+        <w:t xml:space="preserve">MixedBlackWhite,</w:t>
+      </w:r>
+      <w:r>
+        <w:t xml:space="preserve">”</w:t>
+      </w:r>
+      <w:r>
+        <w:t xml:space="preserve"> </w:t>
+      </w:r>
+      <w:r>
+        <w:t xml:space="preserve">because so much of the plot revolves around this possibility.</w:t>
       </w:r>
     </w:p>
     <w:p>
@@ -749,7 +767,7 @@
         <w:pStyle w:val="BodyText"/>
       </w:pPr>
       <w:r>
-        <w:t xml:space="preserve">This point is further amplified when character presence is taken into consideration. Using the event data, it is possible to calculate how often a individual character is present in an event and for how long.</w:t>
+        <w:t xml:space="preserve">This point is further amplified when character presence is taken into consideration. Using the event data, it is possible to calculate how often an individual character is present in an event and for how long.</w:t>
       </w:r>
       <w:r>
         <w:rPr>
@@ -821,7 +839,7 @@
       <w:r>
         <w:drawing>
           <wp:inline>
-            <wp:extent cx="4902332" cy="2154345"/>
+            <wp:extent cx="5943600" cy="2611933"/>
             <wp:effectExtent b="0" l="0" r="0" t="0"/>
             <wp:docPr descr="Figure 1: Demography by raw count and by character presence. The image on the left shows what percentage of each type of character are present in the text. The image on the right shows how often they appear." title="" id="1" name="Picture"/>
             <a:graphic>
@@ -842,7 +860,7 @@
                   <pic:spPr bwMode="auto">
                     <a:xfrm>
                       <a:off x="0" y="0"/>
-                      <a:ext cx="4902332" cy="2154345"/>
+                      <a:ext cx="5943600" cy="2611933"/>
                     </a:xfrm>
                     <a:prstGeom prst="rect">
                       <a:avLst/>
@@ -882,7 +900,7 @@
         <w:pStyle w:val="BodyText"/>
       </w:pPr>
       <w:r>
-        <w:t xml:space="preserve">Judith and Henry adore Charles Bon when they think he is White, and are able to look past his many fault. Only when his possible Black ancestry is exposed does he suddenly become a threat. Before that moment, Henry learns that Charles not only has an</w:t>
+        <w:t xml:space="preserve">Judith and Henry adore Charles Bon when they think he is White, and are able to look past his many faults. Only when his possible Black ancestry is exposed does he suddenly become a threat. Before that moment, Henry learns that Charles not only has an</w:t>
       </w:r>
       <w:r>
         <w:t xml:space="preserve"> </w:t>
@@ -900,7 +918,7 @@
         <w:t xml:space="preserve"> </w:t>
       </w:r>
       <w:r>
-        <w:t xml:space="preserve">wife and a child, but also discovers that Bon may be his half-brother. Henry is willing to look past bigamy and incest. In the end,</w:t>
+        <w:t xml:space="preserve">wife and a child, but also discovers that Bon may be his half-brother. Henry is willing to look past his morganatic marriage and incest. In the end,</w:t>
       </w:r>
       <w:r>
         <w:t xml:space="preserve"> </w:t>
@@ -1220,25 +1238,7 @@
         <w:t xml:space="preserve"> </w:t>
       </w:r>
       <w:r>
-        <w:t xml:space="preserve">(149). She speaks very little and is present in only 12% of the text. This is to say nothing of the scant textual presence of Charles Etienne’s mother (2%), or his even more marginalized son, Jim Bond (1%), who only says four words:</w:t>
-      </w:r>
-      <w:r>
-        <w:t xml:space="preserve"> </w:t>
-      </w:r>
-      <w:r>
-        <w:t xml:space="preserve">“</w:t>
-      </w:r>
-      <w:r>
-        <w:t xml:space="preserve">Calls me Jim Bond</w:t>
-      </w:r>
-      <w:r>
-        <w:t xml:space="preserve">”</w:t>
-      </w:r>
-      <w:r>
-        <w:t xml:space="preserve"> </w:t>
-      </w:r>
-      <w:r>
-        <w:t xml:space="preserve">(297). By comparison, Charles Bon receives far more attention than all four combined: 24%.</w:t>
+        <w:t xml:space="preserve">(149). She speaks very little and is present in only 12% of the text. This is to say nothing of the scant textual presence of Charles Etienne’s mother (2%), or his even more marginalized son, Jim Bond (1%). By comparison, Charles Bon receives far more attention than all four combined: 24%.</w:t>
       </w:r>
       <w:r>
         <w:br/>
@@ -1640,7 +1640,7 @@
         <w:pStyle w:val="Heading2"/>
       </w:pPr>
       <w:r>
-        <w:t xml:space="preserve">Part 2 Locations:</w:t>
+        <w:t xml:space="preserve">Part 2: Locations</w:t>
       </w:r>
     </w:p>
     <w:bookmarkStart w:id="31" w:name="X770c7214aad377e3c38c671f27947a6afc0fc9d"/>
@@ -1785,7 +1785,7 @@
         <w:t xml:space="preserve"> </w:t>
       </w:r>
       <w:r>
-        <w:t xml:space="preserve">(26). Quite some time elapses before he leaves the county again, and travels to New Orleans to investigate Bon (82). Shortly afterwards, the war breaks out, and he reaches as far west as Virginia, where he supplants John Sartoris and becomes a Colonel (100). Starting in chapter 7, the narrative travels to Virginia again, when Shreve and Quentin start reconstructing Sutpen’s early years in their monastic Harvard dorm (179). From thereon Sutpen travels to Haiti (193), only to come full circle and return to Yoknapatawpha. Even a fairly crude understanding of geography notes the expanding distances Sutpen’s narrative travels: the Mississippi River (</w:t>
+        <w:t xml:space="preserve">(26). Quite some time elapses before he leaves the county again, and travels to New Orleans to investigate Bon (82). Shortly afterwards, the war breaks out, and he reaches as far east as Virginia, where he supplants John Sartoris and becomes a Colonel (100). Starting in chapter 7, the narrative travels to Virginia again, when Shreve and Quentin start reconstructing Sutpen’s early years in their monastic Harvard dorm (179). From thereon Sutpen travels to Haiti (193), only to come full circle and return to Yoknapatawpha. Even a fairly crude understanding of geography notes the expanding distances Sutpen’s narrative travels: the Mississippi River (</w:t>
       </w:r>
       <m:oMath>
         <m:r>
@@ -2086,7 +2086,7 @@
         <w:t xml:space="preserve"> </w:t>
       </w:r>
       <w:r>
-        <w:t xml:space="preserve">as if its continued practice were a natural evolution (11). Charles Bon’s marriage to an</w:t>
+        <w:t xml:space="preserve">as if its continued practice were a natural evolution (11). Charles Bon’s relationship with an</w:t>
       </w:r>
       <w:r>
         <w:t xml:space="preserve"> </w:t>
@@ -2104,7 +2104,7 @@
         <w:t xml:space="preserve"> </w:t>
       </w:r>
       <w:r>
-        <w:t xml:space="preserve">mistress is possible because New Orleans is a sinful places, and the home of a thousand men</w:t>
+        <w:t xml:space="preserve">mistress is possible because New Orleans is a sinful place, and the home of a thousand men</w:t>
       </w:r>
       <w:r>
         <w:t xml:space="preserve"> </w:t>
@@ -2212,7 +2212,7 @@
         <w:t xml:space="preserve"> </w:t>
       </w:r>
       <w:r>
-        <w:t xml:space="preserve">(202). The original sin of slavery is again displaced from South. This time onto an Edenic island in the Caribbean.</w:t>
+        <w:t xml:space="preserve">(202). The original sin of slavery is again displaced from South. This time onto an Edenic and infernal island in the Caribbean.</w:t>
       </w:r>
     </w:p>
     <w:p>
@@ -2331,7 +2331,17 @@
         <w:t xml:space="preserve">Absalom, Absalom</w:t>
       </w:r>
       <w:r>
-        <w:t xml:space="preserve">, in the</w:t>
+        <w:t xml:space="preserve">, in</w:t>
+      </w:r>
+      <w:r>
+        <w:t xml:space="preserve"> </w:t>
+      </w:r>
+      <w:r>
+        <w:rPr>
+          <w:iCs/>
+          <w:i/>
+        </w:rPr>
+        <w:t xml:space="preserve">The</w:t>
       </w:r>
       <w:r>
         <w:t xml:space="preserve"> </w:t>
@@ -2418,7 +2428,7 @@
         <w:t xml:space="preserve">“</w:t>
       </w:r>
       <w:r>
-        <w:t xml:space="preserve">a few thousand years, I who regard you will also have sprung form the loins of African kings</w:t>
+        <w:t xml:space="preserve">a few thousand years, I who regard you will also have sprung from the loins of African kings</w:t>
       </w:r>
       <w:r>
         <w:t xml:space="preserve">”</w:t>
@@ -2662,7 +2672,7 @@
         <w:t xml:space="preserve">(Egan 201–02; C. Brooks; Matlack)</w:t>
       </w:r>
       <w:r>
-        <w:t xml:space="preserve">, but it was not until the assiduous work of Steve Railton in 2003 that it became possible to visualize its chronology on a digital timeline.</w:t>
+        <w:t xml:space="preserve">, but it was not until the assiduous work of Stephen Railton in 2003 that it became possible to visualize its chronology on a digital timeline.</w:t>
       </w:r>
       <w:r>
         <w:rPr>
@@ -2882,7 +2892,7 @@
       <w:r>
         <w:drawing>
           <wp:inline>
-            <wp:extent cx="4902332" cy="1914973"/>
+            <wp:extent cx="5943600" cy="2321718"/>
             <wp:effectExtent b="0" l="0" r="0" t="0"/>
             <wp:docPr descr="Figure 3: Plot Structure of Absalom, Absalom!. Particularly notable, is the repetition of an S pattern throughout. This indicates a similar structure across the chapters." title="" id="1" name="Picture"/>
             <a:graphic>
@@ -2903,7 +2913,7 @@
                   <pic:spPr bwMode="auto">
                     <a:xfrm>
                       <a:off x="0" y="0"/>
-                      <a:ext cx="4902332" cy="1914973"/>
+                      <a:ext cx="5943600" cy="2321718"/>
                     </a:xfrm>
                     <a:prstGeom prst="rect">
                       <a:avLst/>
@@ -3125,7 +3135,7 @@
         <w:t xml:space="preserve">(Zoellner 500; Hodgson 103–04; P. Brooks 263)</w:t>
       </w:r>
       <w:r>
-        <w:t xml:space="preserve">. Computational analysis amplifies these interpretations by visualizing how Faulkner’s language resists the possiblity of telling a story fully.</w:t>
+        <w:t xml:space="preserve">. Computational analysis amplifies these interpretations by visualizing how Faulkner’s language resists the possibility of telling a story fully.</w:t>
       </w:r>
     </w:p>
     <w:p>
@@ -3591,10 +3601,10 @@
         <w:t xml:space="preserve"> </w:t>
       </w:r>
       <w:r>
-        <w:t xml:space="preserve">Bernhardsson et al.</w:t>
-      </w:r>
-      <w:r>
-        <w:t xml:space="preserve"> </w:t>
+        <w:t xml:space="preserve">(Chacoma and Zanette 4; Bernhardsson et al. 14)</w:t>
+      </w:r>
+      <w:r>
+        <w:t xml:space="preserve">.</w:t>
       </w:r>
       <w:r>
         <w:rPr>
@@ -3633,7 +3643,7 @@
         <w:t xml:space="preserve"> </w:t>
       </w:r>
       <w:r>
-        <w:t xml:space="preserve">indicates the number of words in the phrase. Thus, an n-gram can be two words: Charles Bon, or it can be much longer. The longest n-gram is the sixteen word sentence,</w:t>
+        <w:t xml:space="preserve">indicates the number of words in the phrase. Thus, an n-gram can be two words: Charles Bon, or it can be much longer. The longest n-gram is the sixteen-word sentence,</w:t>
       </w:r>
       <w:r>
         <w:t xml:space="preserve"> </w:t>

</xml_diff>